<commit_message>
feat(automation): enhance registration flow and document automation system
</commit_message>
<xml_diff>
--- a/rusun-backend/app/templates/template_ba_wawancara.docx
+++ b/rusun-backend/app/templates/template_ba_wawancara.docx
@@ -1,6 +1,6 @@
 
 <file path=word/document.xml><?xml version="1.0" encoding="utf-8"?>
-<w:document xmlns:wpc="http://schemas.microsoft.com/office/word/2010/wordprocessingCanvas" xmlns:mc="http://schemas.openxmlformats.org/markup-compatibility/2006" xmlns:o="urn:schemas-microsoft-com:office:office" xmlns:r="http://schemas.openxmlformats.org/officeDocument/2006/relationships" xmlns:m="http://schemas.openxmlformats.org/officeDocument/2006/math" xmlns:v="urn:schemas-microsoft-com:vml" xmlns:wp14="http://schemas.microsoft.com/office/word/2010/wordprocessingDrawing" xmlns:wp="http://schemas.openxmlformats.org/drawingml/2006/wordprocessingDrawing" xmlns:w10="urn:schemas-microsoft-com:office:word" xmlns:w="http://schemas.openxmlformats.org/wordprocessingml/2006/main" xmlns:w14="http://schemas.microsoft.com/office/word/2010/wordml" xmlns:wpg="http://schemas.microsoft.com/office/word/2010/wordprocessingGroup" xmlns:wpi="http://schemas.microsoft.com/office/word/2010/wordprocessingInk" xmlns:wne="http://schemas.microsoft.com/office/word/2006/wordml" xmlns:wps="http://schemas.microsoft.com/office/word/2010/wordprocessingShape" mc:Ignorable="w14 wp14">
+<w:document xmlns:wpc="http://schemas.microsoft.com/office/word/2010/wordprocessingCanvas" xmlns:cx="http://schemas.microsoft.com/office/drawing/2014/chartex" xmlns:cx1="http://schemas.microsoft.com/office/drawing/2015/9/8/chartex" xmlns:cx2="http://schemas.microsoft.com/office/drawing/2015/10/21/chartex" xmlns:cx3="http://schemas.microsoft.com/office/drawing/2016/5/9/chartex" xmlns:cx4="http://schemas.microsoft.com/office/drawing/2016/5/10/chartex" xmlns:cx5="http://schemas.microsoft.com/office/drawing/2016/5/11/chartex" xmlns:cx6="http://schemas.microsoft.com/office/drawing/2016/5/12/chartex" xmlns:cx7="http://schemas.microsoft.com/office/drawing/2016/5/13/chartex" xmlns:cx8="http://schemas.microsoft.com/office/drawing/2016/5/14/chartex" xmlns:mc="http://schemas.openxmlformats.org/markup-compatibility/2006" xmlns:aink="http://schemas.microsoft.com/office/drawing/2016/ink" xmlns:am3d="http://schemas.microsoft.com/office/drawing/2017/model3d" xmlns:o="urn:schemas-microsoft-com:office:office" xmlns:r="http://schemas.openxmlformats.org/officeDocument/2006/relationships" xmlns:m="http://schemas.openxmlformats.org/officeDocument/2006/math" xmlns:v="urn:schemas-microsoft-com:vml" xmlns:wp14="http://schemas.microsoft.com/office/word/2010/wordprocessingDrawing" xmlns:wp="http://schemas.openxmlformats.org/drawingml/2006/wordprocessingDrawing" xmlns:w10="urn:schemas-microsoft-com:office:word" xmlns:w="http://schemas.openxmlformats.org/wordprocessingml/2006/main" xmlns:w14="http://schemas.microsoft.com/office/word/2010/wordml" xmlns:w15="http://schemas.microsoft.com/office/word/2012/wordml" xmlns:w16cex="http://schemas.microsoft.com/office/word/2018/wordml/cex" xmlns:w16cid="http://schemas.microsoft.com/office/word/2016/wordml/cid" xmlns:w16="http://schemas.microsoft.com/office/word/2018/wordml" xmlns:w16sdtdh="http://schemas.microsoft.com/office/word/2020/wordml/sdtdatahash" xmlns:w16se="http://schemas.microsoft.com/office/word/2015/wordml/symex" xmlns:wpg="http://schemas.microsoft.com/office/word/2010/wordprocessingGroup" xmlns:wpi="http://schemas.microsoft.com/office/word/2010/wordprocessingInk" xmlns:wne="http://schemas.microsoft.com/office/word/2006/wordml" xmlns:wps="http://schemas.microsoft.com/office/word/2010/wordprocessingShape" mc:Ignorable="w14 w15 w16se w16cid w16 w16cex w16sdtdh wp14">
   <w:body>
     <w:p>
       <w:pPr>
@@ -18,7 +18,7 @@
           <w:noProof/>
           <w:lang w:val="id-ID" w:eastAsia="id-ID"/>
         </w:rPr>
-        <w:pict>
+        <w:object w:dxaOrig="1440" w:dyaOrig="1440" w14:anchorId="1C6B31A4">
           <v:shapetype id="_x0000_t75" coordsize="21600,21600" o:spt="75" o:preferrelative="t" path="m@4@5l@4@11@9@11@9@5xe" filled="f" stroked="f">
             <v:stroke joinstyle="miter"/>
             <v:formulas>
@@ -39,10 +39,10 @@
             <o:lock v:ext="edit" aspectratio="t"/>
           </v:shapetype>
           <v:shape id="_x0000_s1027" type="#_x0000_t75" style="position:absolute;margin-left:-24.75pt;margin-top:1.85pt;width:64.6pt;height:71.1pt;z-index:251661312;visibility:visible;mso-wrap-style:tight;mso-wrap-edited:f">
-            <v:imagedata r:id="rId7" o:title=""/>
+            <v:imagedata r:id="rId6" o:title=""/>
           </v:shape>
-          <o:OLEObject Type="Embed" ProgID="Word.Picture.8" ShapeID="_x0000_s1027" DrawAspect="Content" ObjectID="_1831877246" r:id="rId8"/>
-        </w:pict>
+          <o:OLEObject Type="Embed" ProgID="Word.Picture.8" ShapeID="_x0000_s1027" DrawAspect="Content" ObjectID="_1837432680" r:id="rId7"/>
+        </w:object>
       </w:r>
       <w:r>
         <w:rPr>
@@ -148,7 +148,127 @@
           <w:sz w:val="20"/>
           <w:szCs w:val="20"/>
         </w:rPr>
-        <w:t>At-taqwa Kelurahan Cigugur Tengah Kecamatan Cigugur Tengah Kota Cimahi 40522</w:t>
+        <w:t>At-</w:t>
+      </w:r>
+      <w:proofErr w:type="spellStart"/>
+      <w:r>
+        <w:rPr>
+          <w:rFonts w:ascii="Arial" w:hAnsi="Arial" w:cs="Arial"/>
+          <w:bCs/>
+          <w:sz w:val="20"/>
+          <w:szCs w:val="20"/>
+        </w:rPr>
+        <w:t>taqwa</w:t>
+      </w:r>
+      <w:proofErr w:type="spellEnd"/>
+      <w:r>
+        <w:rPr>
+          <w:rFonts w:ascii="Arial" w:hAnsi="Arial" w:cs="Arial"/>
+          <w:bCs/>
+          <w:sz w:val="20"/>
+          <w:szCs w:val="20"/>
+        </w:rPr>
+        <w:t xml:space="preserve"> </w:t>
+      </w:r>
+      <w:proofErr w:type="spellStart"/>
+      <w:r>
+        <w:rPr>
+          <w:rFonts w:ascii="Arial" w:hAnsi="Arial" w:cs="Arial"/>
+          <w:bCs/>
+          <w:sz w:val="20"/>
+          <w:szCs w:val="20"/>
+        </w:rPr>
+        <w:t>Kelurahan</w:t>
+      </w:r>
+      <w:proofErr w:type="spellEnd"/>
+      <w:r>
+        <w:rPr>
+          <w:rFonts w:ascii="Arial" w:hAnsi="Arial" w:cs="Arial"/>
+          <w:bCs/>
+          <w:sz w:val="20"/>
+          <w:szCs w:val="20"/>
+        </w:rPr>
+        <w:t xml:space="preserve"> </w:t>
+      </w:r>
+      <w:proofErr w:type="spellStart"/>
+      <w:r>
+        <w:rPr>
+          <w:rFonts w:ascii="Arial" w:hAnsi="Arial" w:cs="Arial"/>
+          <w:bCs/>
+          <w:sz w:val="20"/>
+          <w:szCs w:val="20"/>
+        </w:rPr>
+        <w:t>Cigugur</w:t>
+      </w:r>
+      <w:proofErr w:type="spellEnd"/>
+      <w:r>
+        <w:rPr>
+          <w:rFonts w:ascii="Arial" w:hAnsi="Arial" w:cs="Arial"/>
+          <w:bCs/>
+          <w:sz w:val="20"/>
+          <w:szCs w:val="20"/>
+        </w:rPr>
+        <w:t xml:space="preserve"> Tengah </w:t>
+      </w:r>
+      <w:proofErr w:type="spellStart"/>
+      <w:r>
+        <w:rPr>
+          <w:rFonts w:ascii="Arial" w:hAnsi="Arial" w:cs="Arial"/>
+          <w:bCs/>
+          <w:sz w:val="20"/>
+          <w:szCs w:val="20"/>
+        </w:rPr>
+        <w:t>Kecamatan</w:t>
+      </w:r>
+      <w:proofErr w:type="spellEnd"/>
+      <w:r>
+        <w:rPr>
+          <w:rFonts w:ascii="Arial" w:hAnsi="Arial" w:cs="Arial"/>
+          <w:bCs/>
+          <w:sz w:val="20"/>
+          <w:szCs w:val="20"/>
+        </w:rPr>
+        <w:t xml:space="preserve"> </w:t>
+      </w:r>
+      <w:proofErr w:type="spellStart"/>
+      <w:r>
+        <w:rPr>
+          <w:rFonts w:ascii="Arial" w:hAnsi="Arial" w:cs="Arial"/>
+          <w:bCs/>
+          <w:sz w:val="20"/>
+          <w:szCs w:val="20"/>
+        </w:rPr>
+        <w:t>Cigugur</w:t>
+      </w:r>
+      <w:proofErr w:type="spellEnd"/>
+      <w:r>
+        <w:rPr>
+          <w:rFonts w:ascii="Arial" w:hAnsi="Arial" w:cs="Arial"/>
+          <w:bCs/>
+          <w:sz w:val="20"/>
+          <w:szCs w:val="20"/>
+        </w:rPr>
+        <w:t xml:space="preserve"> Tengah Kota </w:t>
+      </w:r>
+      <w:proofErr w:type="spellStart"/>
+      <w:r>
+        <w:rPr>
+          <w:rFonts w:ascii="Arial" w:hAnsi="Arial" w:cs="Arial"/>
+          <w:bCs/>
+          <w:sz w:val="20"/>
+          <w:szCs w:val="20"/>
+        </w:rPr>
+        <w:t>Cimahi</w:t>
+      </w:r>
+      <w:proofErr w:type="spellEnd"/>
+      <w:r>
+        <w:rPr>
+          <w:rFonts w:ascii="Arial" w:hAnsi="Arial" w:cs="Arial"/>
+          <w:bCs/>
+          <w:sz w:val="20"/>
+          <w:szCs w:val="20"/>
+        </w:rPr>
+        <w:t xml:space="preserve"> 40522</w:t>
       </w:r>
     </w:p>
     <w:p>
@@ -208,7 +328,7 @@
         <mc:AlternateContent>
           <mc:Choice Requires="wps">
             <w:drawing>
-              <wp:anchor distT="0" distB="0" distL="114300" distR="114300" simplePos="0" relativeHeight="251660288" behindDoc="0" locked="0" layoutInCell="1" allowOverlap="1">
+              <wp:anchor distT="0" distB="0" distL="114300" distR="114300" simplePos="0" relativeHeight="251660288" behindDoc="0" locked="0" layoutInCell="1" allowOverlap="1" wp14:anchorId="575C0F7B" wp14:editId="01CAD6A7">
                 <wp:simplePos x="0" y="0"/>
                 <wp:positionH relativeFrom="column">
                   <wp:posOffset>-386080</wp:posOffset>
@@ -269,7 +389,7 @@
           </mc:Choice>
           <mc:Fallback>
             <w:pict>
-              <v:line id="Line 2" o:spid="_x0000_s1026" style="position:absolute;flip:y;z-index:251660288;visibility:visible;mso-wrap-style:square;mso-width-percent:0;mso-height-percent:0;mso-wrap-distance-left:9pt;mso-wrap-distance-top:0;mso-wrap-distance-right:9pt;mso-wrap-distance-bottom:0;mso-position-horizontal:absolute;mso-position-horizontal-relative:text;mso-position-vertical:absolute;mso-position-vertical-relative:text;mso-width-percent:0;mso-height-percent:0;mso-width-relative:page;mso-height-relative:page" from="-30.4pt,9.65pt" to="502.4pt,9.65pt" o:gfxdata="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" strokeweight="4.5pt">
+              <v:line w14:anchorId="548B9BEE" id="Line 2" o:spid="_x0000_s1026" style="position:absolute;flip:y;z-index:251660288;visibility:visible;mso-wrap-style:square;mso-width-percent:0;mso-height-percent:0;mso-wrap-distance-left:9pt;mso-wrap-distance-top:0;mso-wrap-distance-right:9pt;mso-wrap-distance-bottom:0;mso-position-horizontal:absolute;mso-position-horizontal-relative:text;mso-position-vertical:absolute;mso-position-vertical-relative:text;mso-width-percent:0;mso-height-percent:0;mso-width-relative:page;mso-height-relative:page" from="-30.4pt,9.65pt" to="502.4pt,9.65pt" o:gfxdata="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" strokeweight="4.5pt">
                 <v:stroke linestyle="thickThin"/>
               </v:line>
             </w:pict>
@@ -344,14 +464,7 @@
           <w:b/>
           <w:lang w:val="id-ID"/>
         </w:rPr>
-        <w:t xml:space="preserve"> : 648.1/S</w:t>
-      </w:r>
-      <w:r>
-        <w:rPr>
-          <w:rFonts w:ascii="Bookman Old Style" w:hAnsi="Bookman Old Style"/>
-          <w:b/>
-        </w:rPr>
-        <w:t>K</w:t>
+        <w:t xml:space="preserve"> : </w:t>
       </w:r>
       <w:r>
         <w:rPr>
@@ -359,36 +472,7 @@
           <w:b/>
           <w:lang w:val="id-ID"/>
         </w:rPr>
-        <w:t>/</w:t>
-      </w:r>
-      <w:r>
-        <w:rPr>
-          <w:rFonts w:ascii="Bookman Old Style" w:hAnsi="Bookman Old Style"/>
-          <w:b/>
-        </w:rPr>
-        <w:t>01.06</w:t>
-      </w:r>
-      <w:r>
-        <w:rPr>
-          <w:rFonts w:ascii="Bookman Old Style" w:hAnsi="Bookman Old Style"/>
-          <w:b/>
-        </w:rPr>
-        <w:t>/</w:t>
-      </w:r>
-      <w:r>
-        <w:rPr>
-          <w:rFonts w:ascii="Bookman Old Style" w:hAnsi="Bookman Old Style"/>
-          <w:b/>
-          <w:lang w:val="id-ID"/>
-        </w:rPr>
-        <w:t>UPTD.RSN/</w:t>
-      </w:r>
-      <w:r>
-        <w:rPr>
-          <w:rFonts w:ascii="Bookman Old Style" w:hAnsi="Bookman Old Style"/>
-          <w:b/>
-        </w:rPr>
-        <w:t>2026</w:t>
+        <w:t>{{sk_number}}</w:t>
       </w:r>
     </w:p>
     <w:p>
@@ -429,7 +513,30 @@
           <w:rFonts w:ascii="Bookman Old Style" w:hAnsi="Bookman Old Style"/>
           <w:b/>
         </w:rPr>
-        <w:t>HUNI RUSUNAWA KOTA CIMAHI TAHUN 2024</w:t>
+        <w:t xml:space="preserve">HUNI RUSUNAWA KOTA CIMAHI TAHUN </w:t>
+      </w:r>
+      <w:r>
+        <w:rPr>
+          <w:rFonts w:ascii="Bookman Old Style" w:hAnsi="Bookman Old Style"/>
+          <w:b/>
+        </w:rPr>
+        <w:t>{{</w:t>
+      </w:r>
+      <w:proofErr w:type="spellStart"/>
+      <w:r>
+        <w:rPr>
+          <w:rFonts w:ascii="Bookman Old Style" w:hAnsi="Bookman Old Style"/>
+          <w:b/>
+        </w:rPr>
+        <w:t>tahun_sk</w:t>
+      </w:r>
+      <w:proofErr w:type="spellEnd"/>
+      <w:r>
+        <w:rPr>
+          <w:rFonts w:ascii="Bookman Old Style" w:hAnsi="Bookman Old Style"/>
+          <w:b/>
+        </w:rPr>
+        <w:t>}}</w:t>
       </w:r>
     </w:p>
     <w:p>
@@ -449,72 +556,321 @@
           <w:rFonts w:ascii="Bookman Old Style" w:hAnsi="Bookman Old Style"/>
         </w:rPr>
       </w:pPr>
-      <w:r>
-        <w:rPr>
-          <w:rFonts w:ascii="Bookman Old Style" w:hAnsi="Bookman Old Style"/>
-        </w:rPr>
-        <w:t>Berdasarkan hasil</w:t>
-      </w:r>
-      <w:r>
-        <w:rPr>
-          <w:rFonts w:ascii="Bookman Old Style" w:hAnsi="Bookman Old Style"/>
-        </w:rPr>
-        <w:t xml:space="preserve"> verifikasi dan wawancara dengan calon penghuni </w:t>
-      </w:r>
-      <w:r>
-        <w:rPr>
-          <w:rFonts w:ascii="Bookman Old Style" w:hAnsi="Bookman Old Style"/>
-        </w:rPr>
-        <w:t>Rusunawa Kota Cimahi</w:t>
-      </w:r>
-      <w:r>
-        <w:rPr>
-          <w:rFonts w:ascii="Bookman Old Style" w:hAnsi="Bookman Old Style"/>
-        </w:rPr>
-        <w:t xml:space="preserve"> pada hari </w:t>
-      </w:r>
-      <w:r>
-        <w:rPr>
-          <w:rFonts w:ascii="Bookman Old Style" w:hAnsi="Bookman Old Style"/>
-        </w:rPr>
-        <w:t xml:space="preserve">Selasa </w:t>
-      </w:r>
+      <w:proofErr w:type="spellStart"/>
+      <w:r>
+        <w:rPr>
+          <w:rFonts w:ascii="Bookman Old Style" w:hAnsi="Bookman Old Style"/>
+        </w:rPr>
+        <w:t>Berdasarkan</w:t>
+      </w:r>
+      <w:proofErr w:type="spellEnd"/>
+      <w:r>
+        <w:rPr>
+          <w:rFonts w:ascii="Bookman Old Style" w:hAnsi="Bookman Old Style"/>
+        </w:rPr>
+        <w:t xml:space="preserve"> </w:t>
+      </w:r>
+      <w:proofErr w:type="spellStart"/>
+      <w:r>
+        <w:rPr>
+          <w:rFonts w:ascii="Bookman Old Style" w:hAnsi="Bookman Old Style"/>
+        </w:rPr>
+        <w:t>hasil</w:t>
+      </w:r>
+      <w:proofErr w:type="spellEnd"/>
+      <w:r>
+        <w:rPr>
+          <w:rFonts w:ascii="Bookman Old Style" w:hAnsi="Bookman Old Style"/>
+        </w:rPr>
+        <w:t xml:space="preserve"> </w:t>
+      </w:r>
+      <w:proofErr w:type="spellStart"/>
+      <w:r>
+        <w:rPr>
+          <w:rFonts w:ascii="Bookman Old Style" w:hAnsi="Bookman Old Style"/>
+        </w:rPr>
+        <w:t>verifikasi</w:t>
+      </w:r>
+      <w:proofErr w:type="spellEnd"/>
+      <w:r>
+        <w:rPr>
+          <w:rFonts w:ascii="Bookman Old Style" w:hAnsi="Bookman Old Style"/>
+        </w:rPr>
+        <w:t xml:space="preserve"> dan </w:t>
+      </w:r>
+      <w:proofErr w:type="spellStart"/>
+      <w:r>
+        <w:rPr>
+          <w:rFonts w:ascii="Bookman Old Style" w:hAnsi="Bookman Old Style"/>
+        </w:rPr>
+        <w:t>wawancara</w:t>
+      </w:r>
+      <w:proofErr w:type="spellEnd"/>
+      <w:r>
+        <w:rPr>
+          <w:rFonts w:ascii="Bookman Old Style" w:hAnsi="Bookman Old Style"/>
+        </w:rPr>
+        <w:t xml:space="preserve"> </w:t>
+      </w:r>
+      <w:proofErr w:type="spellStart"/>
+      <w:r>
+        <w:rPr>
+          <w:rFonts w:ascii="Bookman Old Style" w:hAnsi="Bookman Old Style"/>
+        </w:rPr>
+        <w:t>dengan</w:t>
+      </w:r>
+      <w:proofErr w:type="spellEnd"/>
+      <w:r>
+        <w:rPr>
+          <w:rFonts w:ascii="Bookman Old Style" w:hAnsi="Bookman Old Style"/>
+        </w:rPr>
+        <w:t xml:space="preserve"> </w:t>
+      </w:r>
+      <w:proofErr w:type="spellStart"/>
+      <w:r>
+        <w:rPr>
+          <w:rFonts w:ascii="Bookman Old Style" w:hAnsi="Bookman Old Style"/>
+        </w:rPr>
+        <w:t>calon</w:t>
+      </w:r>
+      <w:proofErr w:type="spellEnd"/>
+      <w:r>
+        <w:rPr>
+          <w:rFonts w:ascii="Bookman Old Style" w:hAnsi="Bookman Old Style"/>
+        </w:rPr>
+        <w:t xml:space="preserve"> </w:t>
+      </w:r>
+      <w:proofErr w:type="spellStart"/>
+      <w:r>
+        <w:rPr>
+          <w:rFonts w:ascii="Bookman Old Style" w:hAnsi="Bookman Old Style"/>
+        </w:rPr>
+        <w:t>penghuni</w:t>
+      </w:r>
+      <w:proofErr w:type="spellEnd"/>
+      <w:r>
+        <w:rPr>
+          <w:rFonts w:ascii="Bookman Old Style" w:hAnsi="Bookman Old Style"/>
+        </w:rPr>
+        <w:t xml:space="preserve"> </w:t>
+      </w:r>
+      <w:proofErr w:type="spellStart"/>
+      <w:r>
+        <w:rPr>
+          <w:rFonts w:ascii="Bookman Old Style" w:hAnsi="Bookman Old Style"/>
+        </w:rPr>
+        <w:t>Rusunawa</w:t>
+      </w:r>
+      <w:proofErr w:type="spellEnd"/>
+      <w:r>
+        <w:rPr>
+          <w:rFonts w:ascii="Bookman Old Style" w:hAnsi="Bookman Old Style"/>
+        </w:rPr>
+        <w:t xml:space="preserve"> Kota </w:t>
+      </w:r>
+      <w:proofErr w:type="spellStart"/>
+      <w:r>
+        <w:rPr>
+          <w:rFonts w:ascii="Bookman Old Style" w:hAnsi="Bookman Old Style"/>
+        </w:rPr>
+        <w:t>Cimahi</w:t>
+      </w:r>
+      <w:proofErr w:type="spellEnd"/>
+      <w:r>
+        <w:rPr>
+          <w:rFonts w:ascii="Bookman Old Style" w:hAnsi="Bookman Old Style"/>
+        </w:rPr>
+        <w:t xml:space="preserve"> pada </w:t>
+      </w:r>
+      <w:proofErr w:type="spellStart"/>
+      <w:r>
+        <w:rPr>
+          <w:rFonts w:ascii="Bookman Old Style" w:hAnsi="Bookman Old Style"/>
+        </w:rPr>
+        <w:t>hari</w:t>
+      </w:r>
+      <w:proofErr w:type="spellEnd"/>
+      <w:r>
+        <w:rPr>
+          <w:rFonts w:ascii="Bookman Old Style" w:hAnsi="Bookman Old Style"/>
+        </w:rPr>
+        <w:t xml:space="preserve"> </w:t>
+      </w:r>
+      <w:r>
+        <w:rPr>
+          <w:rFonts w:ascii="Bookman Old Style" w:hAnsi="Bookman Old Style"/>
+        </w:rPr>
+        <w:t>{{</w:t>
+      </w:r>
+      <w:proofErr w:type="spellStart"/>
+      <w:r>
+        <w:rPr>
+          <w:rFonts w:ascii="Bookman Old Style" w:hAnsi="Bookman Old Style"/>
+        </w:rPr>
+        <w:t>hari_sk</w:t>
+      </w:r>
+      <w:proofErr w:type="spellEnd"/>
+      <w:r>
+        <w:rPr>
+          <w:rFonts w:ascii="Bookman Old Style" w:hAnsi="Bookman Old Style"/>
+        </w:rPr>
+        <w:t>}}</w:t>
+      </w:r>
+      <w:r>
+        <w:rPr>
+          <w:rFonts w:ascii="Bookman Old Style" w:hAnsi="Bookman Old Style"/>
+        </w:rPr>
+        <w:t xml:space="preserve"> </w:t>
+      </w:r>
+      <w:proofErr w:type="spellStart"/>
       <w:r>
         <w:rPr>
           <w:rFonts w:ascii="Bookman Old Style" w:hAnsi="Bookman Old Style"/>
         </w:rPr>
         <w:t>tanggal</w:t>
       </w:r>
-      <w:r>
-        <w:rPr>
-          <w:rFonts w:ascii="Bookman Old Style" w:hAnsi="Bookman Old Style"/>
-        </w:rPr>
-        <w:t xml:space="preserve"> 03</w:t>
-      </w:r>
-      <w:r>
-        <w:rPr>
-          <w:rFonts w:ascii="Bookman Old Style" w:hAnsi="Bookman Old Style"/>
-        </w:rPr>
-        <w:t xml:space="preserve"> </w:t>
-      </w:r>
-      <w:r>
-        <w:rPr>
-          <w:rFonts w:ascii="Bookman Old Style" w:hAnsi="Bookman Old Style"/>
-        </w:rPr>
-        <w:t>Bulan Februari Tahun 2026</w:t>
-      </w:r>
-      <w:r>
-        <w:rPr>
-          <w:rFonts w:ascii="Bookman Old Style" w:hAnsi="Bookman Old Style"/>
-        </w:rPr>
-        <w:t xml:space="preserve"> </w:t>
-      </w:r>
-      <w:r>
-        <w:rPr>
-          <w:rFonts w:ascii="Bookman Old Style" w:hAnsi="Bookman Old Style"/>
-        </w:rPr>
-        <w:t xml:space="preserve">dengan ini </w:t>
-      </w:r>
+      <w:proofErr w:type="spellEnd"/>
+      <w:r>
+        <w:rPr>
+          <w:rFonts w:ascii="Bookman Old Style" w:hAnsi="Bookman Old Style"/>
+        </w:rPr>
+        <w:t xml:space="preserve"> </w:t>
+      </w:r>
+      <w:r>
+        <w:rPr>
+          <w:rFonts w:ascii="Bookman Old Style" w:hAnsi="Bookman Old Style"/>
+        </w:rPr>
+        <w:t>{{</w:t>
+      </w:r>
+      <w:proofErr w:type="spellStart"/>
+      <w:r>
+        <w:rPr>
+          <w:rFonts w:ascii="Bookman Old Style" w:hAnsi="Bookman Old Style"/>
+        </w:rPr>
+        <w:t>tanggal_sk</w:t>
+      </w:r>
+      <w:proofErr w:type="spellEnd"/>
+      <w:r>
+        <w:rPr>
+          <w:rFonts w:ascii="Bookman Old Style" w:hAnsi="Bookman Old Style"/>
+        </w:rPr>
+        <w:t>}}</w:t>
+      </w:r>
+      <w:r>
+        <w:rPr>
+          <w:rFonts w:ascii="Bookman Old Style" w:hAnsi="Bookman Old Style"/>
+        </w:rPr>
+        <w:t xml:space="preserve"> </w:t>
+      </w:r>
+      <w:proofErr w:type="spellStart"/>
+      <w:r>
+        <w:rPr>
+          <w:rFonts w:ascii="Bookman Old Style" w:hAnsi="Bookman Old Style"/>
+        </w:rPr>
+        <w:t>Bulan</w:t>
+      </w:r>
+      <w:proofErr w:type="spellEnd"/>
+      <w:r>
+        <w:rPr>
+          <w:rFonts w:ascii="Bookman Old Style" w:hAnsi="Bookman Old Style"/>
+        </w:rPr>
+        <w:t xml:space="preserve"> </w:t>
+      </w:r>
+      <w:r>
+        <w:rPr>
+          <w:rFonts w:ascii="Bookman Old Style" w:hAnsi="Bookman Old Style"/>
+        </w:rPr>
+        <w:t>{{</w:t>
+      </w:r>
+      <w:proofErr w:type="spellStart"/>
+      <w:r>
+        <w:rPr>
+          <w:rFonts w:ascii="Bookman Old Style" w:hAnsi="Bookman Old Style"/>
+        </w:rPr>
+        <w:t>bulan_sk_indo</w:t>
+      </w:r>
+      <w:proofErr w:type="spellEnd"/>
+      <w:r>
+        <w:rPr>
+          <w:rFonts w:ascii="Bookman Old Style" w:hAnsi="Bookman Old Style"/>
+        </w:rPr>
+        <w:t>}}</w:t>
+      </w:r>
+      <w:r>
+        <w:rPr>
+          <w:rFonts w:ascii="Bookman Old Style" w:hAnsi="Bookman Old Style"/>
+        </w:rPr>
+        <w:t xml:space="preserve"> </w:t>
+      </w:r>
+      <w:proofErr w:type="spellStart"/>
+      <w:r>
+        <w:rPr>
+          <w:rFonts w:ascii="Bookman Old Style" w:hAnsi="Bookman Old Style"/>
+        </w:rPr>
+        <w:t>Tahun</w:t>
+      </w:r>
+      <w:proofErr w:type="spellEnd"/>
+      <w:r>
+        <w:rPr>
+          <w:rFonts w:ascii="Bookman Old Style" w:hAnsi="Bookman Old Style"/>
+        </w:rPr>
+        <w:t xml:space="preserve"> </w:t>
+      </w:r>
+      <w:r>
+        <w:rPr>
+          <w:rFonts w:ascii="Bookman Old Style" w:hAnsi="Bookman Old Style"/>
+        </w:rPr>
+        <w:t>{{</w:t>
+      </w:r>
+      <w:proofErr w:type="spellStart"/>
+      <w:r>
+        <w:rPr>
+          <w:rFonts w:ascii="Bookman Old Style" w:hAnsi="Bookman Old Style"/>
+        </w:rPr>
+        <w:t>tahun_sk</w:t>
+      </w:r>
+      <w:proofErr w:type="spellEnd"/>
+      <w:r>
+        <w:rPr>
+          <w:rFonts w:ascii="Bookman Old Style" w:hAnsi="Bookman Old Style"/>
+        </w:rPr>
+        <w:t>}}</w:t>
+      </w:r>
+      <w:r>
+        <w:rPr>
+          <w:rFonts w:ascii="Bookman Old Style" w:hAnsi="Bookman Old Style"/>
+        </w:rPr>
+        <w:t xml:space="preserve"> </w:t>
+      </w:r>
+      <w:proofErr w:type="spellStart"/>
+      <w:r>
+        <w:rPr>
+          <w:rFonts w:ascii="Bookman Old Style" w:hAnsi="Bookman Old Style"/>
+        </w:rPr>
+        <w:t>dengan</w:t>
+      </w:r>
+      <w:proofErr w:type="spellEnd"/>
+      <w:r>
+        <w:rPr>
+          <w:rFonts w:ascii="Bookman Old Style" w:hAnsi="Bookman Old Style"/>
+        </w:rPr>
+        <w:t xml:space="preserve"> </w:t>
+      </w:r>
+      <w:proofErr w:type="spellStart"/>
+      <w:r>
+        <w:rPr>
+          <w:rFonts w:ascii="Bookman Old Style" w:hAnsi="Bookman Old Style"/>
+        </w:rPr>
+        <w:t>ini</w:t>
+      </w:r>
+      <w:proofErr w:type="spellEnd"/>
+      <w:r>
+        <w:rPr>
+          <w:rFonts w:ascii="Bookman Old Style" w:hAnsi="Bookman Old Style"/>
+        </w:rPr>
+        <w:t xml:space="preserve"> </w:t>
+      </w:r>
+      <w:proofErr w:type="spellStart"/>
       <w:r>
         <w:rPr>
           <w:rFonts w:ascii="Bookman Old Style" w:hAnsi="Bookman Old Style"/>
@@ -531,27 +887,154 @@
         <w:rPr>
           <w:rFonts w:ascii="Bookman Old Style" w:hAnsi="Bookman Old Style"/>
         </w:rPr>
-        <w:t xml:space="preserve">an </w:t>
-      </w:r>
-      <w:r>
-        <w:rPr>
-          <w:rFonts w:ascii="Bookman Old Style" w:hAnsi="Bookman Old Style"/>
-        </w:rPr>
-        <w:t xml:space="preserve">calon penghuni yang </w:t>
-      </w:r>
-      <w:r>
-        <w:rPr>
-          <w:rFonts w:ascii="Bookman Old Style" w:hAnsi="Bookman Old Style"/>
-        </w:rPr>
-        <w:t>lolos verifikasi dan wawancara. Ad</w:t>
-      </w:r>
-      <w:bookmarkStart w:id="0" w:name="_GoBack"/>
-      <w:bookmarkEnd w:id="0"/>
-      <w:r>
-        <w:rPr>
-          <w:rFonts w:ascii="Bookman Old Style" w:hAnsi="Bookman Old Style"/>
-        </w:rPr>
-        <w:t>apun nama-nama yang lolos adalah sebagai berikut:</w:t>
+        <w:t>an</w:t>
+      </w:r>
+      <w:proofErr w:type="spellEnd"/>
+      <w:r>
+        <w:rPr>
+          <w:rFonts w:ascii="Bookman Old Style" w:hAnsi="Bookman Old Style"/>
+        </w:rPr>
+        <w:t xml:space="preserve"> </w:t>
+      </w:r>
+      <w:proofErr w:type="spellStart"/>
+      <w:r>
+        <w:rPr>
+          <w:rFonts w:ascii="Bookman Old Style" w:hAnsi="Bookman Old Style"/>
+        </w:rPr>
+        <w:t>calon</w:t>
+      </w:r>
+      <w:proofErr w:type="spellEnd"/>
+      <w:r>
+        <w:rPr>
+          <w:rFonts w:ascii="Bookman Old Style" w:hAnsi="Bookman Old Style"/>
+        </w:rPr>
+        <w:t xml:space="preserve"> </w:t>
+      </w:r>
+      <w:proofErr w:type="spellStart"/>
+      <w:r>
+        <w:rPr>
+          <w:rFonts w:ascii="Bookman Old Style" w:hAnsi="Bookman Old Style"/>
+        </w:rPr>
+        <w:t>penghuni</w:t>
+      </w:r>
+      <w:proofErr w:type="spellEnd"/>
+      <w:r>
+        <w:rPr>
+          <w:rFonts w:ascii="Bookman Old Style" w:hAnsi="Bookman Old Style"/>
+        </w:rPr>
+        <w:t xml:space="preserve"> yang </w:t>
+      </w:r>
+      <w:proofErr w:type="spellStart"/>
+      <w:r>
+        <w:rPr>
+          <w:rFonts w:ascii="Bookman Old Style" w:hAnsi="Bookman Old Style"/>
+        </w:rPr>
+        <w:t>lolos</w:t>
+      </w:r>
+      <w:proofErr w:type="spellEnd"/>
+      <w:r>
+        <w:rPr>
+          <w:rFonts w:ascii="Bookman Old Style" w:hAnsi="Bookman Old Style"/>
+        </w:rPr>
+        <w:t xml:space="preserve"> </w:t>
+      </w:r>
+      <w:proofErr w:type="spellStart"/>
+      <w:r>
+        <w:rPr>
+          <w:rFonts w:ascii="Bookman Old Style" w:hAnsi="Bookman Old Style"/>
+        </w:rPr>
+        <w:t>verifikasi</w:t>
+      </w:r>
+      <w:proofErr w:type="spellEnd"/>
+      <w:r>
+        <w:rPr>
+          <w:rFonts w:ascii="Bookman Old Style" w:hAnsi="Bookman Old Style"/>
+        </w:rPr>
+        <w:t xml:space="preserve"> dan </w:t>
+      </w:r>
+      <w:proofErr w:type="spellStart"/>
+      <w:r>
+        <w:rPr>
+          <w:rFonts w:ascii="Bookman Old Style" w:hAnsi="Bookman Old Style"/>
+        </w:rPr>
+        <w:t>wawancara</w:t>
+      </w:r>
+      <w:proofErr w:type="spellEnd"/>
+      <w:r>
+        <w:rPr>
+          <w:rFonts w:ascii="Bookman Old Style" w:hAnsi="Bookman Old Style"/>
+        </w:rPr>
+        <w:t xml:space="preserve">. Adapun </w:t>
+      </w:r>
+      <w:proofErr w:type="spellStart"/>
+      <w:r>
+        <w:rPr>
+          <w:rFonts w:ascii="Bookman Old Style" w:hAnsi="Bookman Old Style"/>
+        </w:rPr>
+        <w:t>nama-nama</w:t>
+      </w:r>
+      <w:proofErr w:type="spellEnd"/>
+      <w:r>
+        <w:rPr>
+          <w:rFonts w:ascii="Bookman Old Style" w:hAnsi="Bookman Old Style"/>
+        </w:rPr>
+        <w:t xml:space="preserve"> yang </w:t>
+      </w:r>
+      <w:proofErr w:type="spellStart"/>
+      <w:r>
+        <w:rPr>
+          <w:rFonts w:ascii="Bookman Old Style" w:hAnsi="Bookman Old Style"/>
+        </w:rPr>
+        <w:t>lolos</w:t>
+      </w:r>
+      <w:proofErr w:type="spellEnd"/>
+      <w:r>
+        <w:rPr>
+          <w:rFonts w:ascii="Bookman Old Style" w:hAnsi="Bookman Old Style"/>
+        </w:rPr>
+        <w:t xml:space="preserve"> </w:t>
+      </w:r>
+      <w:proofErr w:type="spellStart"/>
+      <w:r>
+        <w:rPr>
+          <w:rFonts w:ascii="Bookman Old Style" w:hAnsi="Bookman Old Style"/>
+        </w:rPr>
+        <w:t>adalah</w:t>
+      </w:r>
+      <w:proofErr w:type="spellEnd"/>
+      <w:r>
+        <w:rPr>
+          <w:rFonts w:ascii="Bookman Old Style" w:hAnsi="Bookman Old Style"/>
+        </w:rPr>
+        <w:t xml:space="preserve"> </w:t>
+      </w:r>
+      <w:proofErr w:type="spellStart"/>
+      <w:r>
+        <w:rPr>
+          <w:rFonts w:ascii="Bookman Old Style" w:hAnsi="Bookman Old Style"/>
+        </w:rPr>
+        <w:t>sebagai</w:t>
+      </w:r>
+      <w:proofErr w:type="spellEnd"/>
+      <w:r>
+        <w:rPr>
+          <w:rFonts w:ascii="Bookman Old Style" w:hAnsi="Bookman Old Style"/>
+        </w:rPr>
+        <w:t xml:space="preserve"> </w:t>
+      </w:r>
+      <w:proofErr w:type="spellStart"/>
+      <w:r>
+        <w:rPr>
+          <w:rFonts w:ascii="Bookman Old Style" w:hAnsi="Bookman Old Style"/>
+        </w:rPr>
+        <w:t>berikut</w:t>
+      </w:r>
+      <w:proofErr w:type="spellEnd"/>
+      <w:r>
+        <w:rPr>
+          <w:rFonts w:ascii="Bookman Old Style" w:hAnsi="Bookman Old Style"/>
+        </w:rPr>
+        <w:t>:</w:t>
       </w:r>
     </w:p>
     <w:p>
@@ -573,10 +1056,10 @@
       </w:tblPr>
       <w:tblGrid>
         <w:gridCol w:w="626"/>
-        <w:gridCol w:w="2693"/>
-        <w:gridCol w:w="2918"/>
-        <w:gridCol w:w="1618"/>
-        <w:gridCol w:w="1843"/>
+        <w:gridCol w:w="2161"/>
+        <w:gridCol w:w="2634"/>
+        <w:gridCol w:w="2262"/>
+        <w:gridCol w:w="2064"/>
       </w:tblGrid>
       <w:tr>
         <w:tc>
@@ -720,7 +1203,21 @@
               <w:rPr>
                 <w:rFonts w:ascii="Bookman Old Style" w:hAnsi="Bookman Old Style"/>
               </w:rPr>
-              <w:t>Maya Mulyaani</w:t>
+              <w:t>{{</w:t>
+            </w:r>
+            <w:proofErr w:type="spellStart"/>
+            <w:r>
+              <w:rPr>
+                <w:rFonts w:ascii="Bookman Old Style" w:hAnsi="Bookman Old Style"/>
+              </w:rPr>
+              <w:t>nama_penyewa</w:t>
+            </w:r>
+            <w:proofErr w:type="spellEnd"/>
+            <w:r>
+              <w:rPr>
+                <w:rFonts w:ascii="Bookman Old Style" w:hAnsi="Bookman Old Style"/>
+              </w:rPr>
+              <w:t>}}</w:t>
             </w:r>
           </w:p>
         </w:tc>
@@ -739,19 +1236,21 @@
               <w:rPr>
                 <w:rFonts w:ascii="Bookman Old Style" w:hAnsi="Bookman Old Style"/>
               </w:rPr>
-              <w:t>Cimindi Barat Rt 04</w:t>
+              <w:t>{{</w:t>
             </w:r>
+            <w:proofErr w:type="spellStart"/>
             <w:r>
               <w:rPr>
                 <w:rFonts w:ascii="Bookman Old Style" w:hAnsi="Bookman Old Style"/>
               </w:rPr>
-              <w:t xml:space="preserve"> Rw 1</w:t>
+              <w:t>alamat_sebelumnya</w:t>
             </w:r>
+            <w:proofErr w:type="spellEnd"/>
             <w:r>
               <w:rPr>
                 <w:rFonts w:ascii="Bookman Old Style" w:hAnsi="Bookman Old Style"/>
               </w:rPr>
-              <w:t xml:space="preserve">7 Kel Cibeureum Kec Cimahi Selatan </w:t>
+              <w:t>}}</w:t>
             </w:r>
           </w:p>
         </w:tc>
@@ -770,7 +1269,21 @@
               <w:rPr>
                 <w:rFonts w:ascii="Bookman Old Style" w:hAnsi="Bookman Old Style"/>
               </w:rPr>
-              <w:t>Cigugur Tengah</w:t>
+              <w:t>{{</w:t>
+            </w:r>
+            <w:proofErr w:type="spellStart"/>
+            <w:r>
+              <w:rPr>
+                <w:rFonts w:ascii="Bookman Old Style" w:hAnsi="Bookman Old Style"/>
+              </w:rPr>
+              <w:t>nama_rusunawa</w:t>
+            </w:r>
+            <w:proofErr w:type="spellEnd"/>
+            <w:r>
+              <w:rPr>
+                <w:rFonts w:ascii="Bookman Old Style" w:hAnsi="Bookman Old Style"/>
+              </w:rPr>
+              <w:t>}}</w:t>
             </w:r>
           </w:p>
         </w:tc>
@@ -789,7 +1302,21 @@
               <w:rPr>
                 <w:rFonts w:ascii="Bookman Old Style" w:hAnsi="Bookman Old Style"/>
               </w:rPr>
-              <w:t>Lolos</w:t>
+              <w:t>{{</w:t>
+            </w:r>
+            <w:proofErr w:type="spellStart"/>
+            <w:r>
+              <w:rPr>
+                <w:rFonts w:ascii="Bookman Old Style" w:hAnsi="Bookman Old Style"/>
+              </w:rPr>
+              <w:t>hasil_verifikasi</w:t>
+            </w:r>
+            <w:proofErr w:type="spellEnd"/>
+            <w:r>
+              <w:rPr>
+                <w:rFonts w:ascii="Bookman Old Style" w:hAnsi="Bookman Old Style"/>
+              </w:rPr>
+              <w:t>}}</w:t>
             </w:r>
           </w:p>
         </w:tc>
@@ -894,11 +1421,173 @@
           <w:rFonts w:ascii="Bookman Old Style" w:hAnsi="Bookman Old Style"/>
         </w:rPr>
       </w:pPr>
-      <w:r>
-        <w:rPr>
-          <w:rFonts w:ascii="Bookman Old Style" w:hAnsi="Bookman Old Style"/>
-        </w:rPr>
-        <w:t xml:space="preserve">Selanjutnya calon penghuni yang lolos akan dihubungi untuk penandatanganan Perjanjian Sewa Rusunawa Kota Cimahi. </w:t>
+      <w:proofErr w:type="spellStart"/>
+      <w:r>
+        <w:rPr>
+          <w:rFonts w:ascii="Bookman Old Style" w:hAnsi="Bookman Old Style"/>
+        </w:rPr>
+        <w:t>Selanjutnya</w:t>
+      </w:r>
+      <w:proofErr w:type="spellEnd"/>
+      <w:r>
+        <w:rPr>
+          <w:rFonts w:ascii="Bookman Old Style" w:hAnsi="Bookman Old Style"/>
+        </w:rPr>
+        <w:t xml:space="preserve"> </w:t>
+      </w:r>
+      <w:proofErr w:type="spellStart"/>
+      <w:r>
+        <w:rPr>
+          <w:rFonts w:ascii="Bookman Old Style" w:hAnsi="Bookman Old Style"/>
+        </w:rPr>
+        <w:t>calon</w:t>
+      </w:r>
+      <w:proofErr w:type="spellEnd"/>
+      <w:r>
+        <w:rPr>
+          <w:rFonts w:ascii="Bookman Old Style" w:hAnsi="Bookman Old Style"/>
+        </w:rPr>
+        <w:t xml:space="preserve"> </w:t>
+      </w:r>
+      <w:proofErr w:type="spellStart"/>
+      <w:r>
+        <w:rPr>
+          <w:rFonts w:ascii="Bookman Old Style" w:hAnsi="Bookman Old Style"/>
+        </w:rPr>
+        <w:t>penghuni</w:t>
+      </w:r>
+      <w:proofErr w:type="spellEnd"/>
+      <w:r>
+        <w:rPr>
+          <w:rFonts w:ascii="Bookman Old Style" w:hAnsi="Bookman Old Style"/>
+        </w:rPr>
+        <w:t xml:space="preserve"> yang </w:t>
+      </w:r>
+      <w:proofErr w:type="spellStart"/>
+      <w:r>
+        <w:rPr>
+          <w:rFonts w:ascii="Bookman Old Style" w:hAnsi="Bookman Old Style"/>
+        </w:rPr>
+        <w:t>lolos</w:t>
+      </w:r>
+      <w:proofErr w:type="spellEnd"/>
+      <w:r>
+        <w:rPr>
+          <w:rFonts w:ascii="Bookman Old Style" w:hAnsi="Bookman Old Style"/>
+        </w:rPr>
+        <w:t xml:space="preserve"> </w:t>
+      </w:r>
+      <w:proofErr w:type="spellStart"/>
+      <w:r>
+        <w:rPr>
+          <w:rFonts w:ascii="Bookman Old Style" w:hAnsi="Bookman Old Style"/>
+        </w:rPr>
+        <w:t>akan</w:t>
+      </w:r>
+      <w:proofErr w:type="spellEnd"/>
+      <w:r>
+        <w:rPr>
+          <w:rFonts w:ascii="Bookman Old Style" w:hAnsi="Bookman Old Style"/>
+        </w:rPr>
+        <w:t xml:space="preserve"> </w:t>
+      </w:r>
+      <w:proofErr w:type="spellStart"/>
+      <w:r>
+        <w:rPr>
+          <w:rFonts w:ascii="Bookman Old Style" w:hAnsi="Bookman Old Style"/>
+        </w:rPr>
+        <w:t>dihubungi</w:t>
+      </w:r>
+      <w:proofErr w:type="spellEnd"/>
+      <w:r>
+        <w:rPr>
+          <w:rFonts w:ascii="Bookman Old Style" w:hAnsi="Bookman Old Style"/>
+        </w:rPr>
+        <w:t xml:space="preserve"> </w:t>
+      </w:r>
+      <w:proofErr w:type="spellStart"/>
+      <w:r>
+        <w:rPr>
+          <w:rFonts w:ascii="Bookman Old Style" w:hAnsi="Bookman Old Style"/>
+        </w:rPr>
+        <w:t>untuk</w:t>
+      </w:r>
+      <w:proofErr w:type="spellEnd"/>
+      <w:r>
+        <w:rPr>
+          <w:rFonts w:ascii="Bookman Old Style" w:hAnsi="Bookman Old Style"/>
+        </w:rPr>
+        <w:t xml:space="preserve"> </w:t>
+      </w:r>
+      <w:proofErr w:type="spellStart"/>
+      <w:r>
+        <w:rPr>
+          <w:rFonts w:ascii="Bookman Old Style" w:hAnsi="Bookman Old Style"/>
+        </w:rPr>
+        <w:t>penandatanganan</w:t>
+      </w:r>
+      <w:proofErr w:type="spellEnd"/>
+      <w:r>
+        <w:rPr>
+          <w:rFonts w:ascii="Bookman Old Style" w:hAnsi="Bookman Old Style"/>
+        </w:rPr>
+        <w:t xml:space="preserve"> </w:t>
+      </w:r>
+      <w:proofErr w:type="spellStart"/>
+      <w:r>
+        <w:rPr>
+          <w:rFonts w:ascii="Bookman Old Style" w:hAnsi="Bookman Old Style"/>
+        </w:rPr>
+        <w:t>Perjanjian</w:t>
+      </w:r>
+      <w:proofErr w:type="spellEnd"/>
+      <w:r>
+        <w:rPr>
+          <w:rFonts w:ascii="Bookman Old Style" w:hAnsi="Bookman Old Style"/>
+        </w:rPr>
+        <w:t xml:space="preserve"> </w:t>
+      </w:r>
+      <w:proofErr w:type="spellStart"/>
+      <w:r>
+        <w:rPr>
+          <w:rFonts w:ascii="Bookman Old Style" w:hAnsi="Bookman Old Style"/>
+        </w:rPr>
+        <w:t>Sewa</w:t>
+      </w:r>
+      <w:proofErr w:type="spellEnd"/>
+      <w:r>
+        <w:rPr>
+          <w:rFonts w:ascii="Bookman Old Style" w:hAnsi="Bookman Old Style"/>
+        </w:rPr>
+        <w:t xml:space="preserve"> </w:t>
+      </w:r>
+      <w:proofErr w:type="spellStart"/>
+      <w:r>
+        <w:rPr>
+          <w:rFonts w:ascii="Bookman Old Style" w:hAnsi="Bookman Old Style"/>
+        </w:rPr>
+        <w:t>Rusunawa</w:t>
+      </w:r>
+      <w:proofErr w:type="spellEnd"/>
+      <w:r>
+        <w:rPr>
+          <w:rFonts w:ascii="Bookman Old Style" w:hAnsi="Bookman Old Style"/>
+        </w:rPr>
+        <w:t xml:space="preserve"> Kota </w:t>
+      </w:r>
+      <w:proofErr w:type="spellStart"/>
+      <w:r>
+        <w:rPr>
+          <w:rFonts w:ascii="Bookman Old Style" w:hAnsi="Bookman Old Style"/>
+        </w:rPr>
+        <w:t>Cimahi</w:t>
+      </w:r>
+      <w:proofErr w:type="spellEnd"/>
+      <w:r>
+        <w:rPr>
+          <w:rFonts w:ascii="Bookman Old Style" w:hAnsi="Bookman Old Style"/>
+        </w:rPr>
+        <w:t xml:space="preserve">. </w:t>
       </w:r>
     </w:p>
     <w:p>
@@ -928,7 +1617,7 @@
         <mc:AlternateContent>
           <mc:Choice Requires="wps">
             <w:drawing>
-              <wp:anchor distT="0" distB="0" distL="114300" distR="114300" simplePos="0" relativeHeight="251662336" behindDoc="0" locked="0" layoutInCell="1" allowOverlap="1">
+              <wp:anchor distT="0" distB="0" distL="114300" distR="114300" simplePos="0" relativeHeight="251662336" behindDoc="0" locked="0" layoutInCell="1" allowOverlap="1" wp14:anchorId="5D996689" wp14:editId="60FF7381">
                 <wp:simplePos x="0" y="0"/>
                 <wp:positionH relativeFrom="column">
                   <wp:posOffset>2754630</wp:posOffset>
@@ -999,10 +1688,27 @@
                               <w:t>Cimahi,</w:t>
                             </w:r>
                             <w:r>
-                              <w:rPr>
-                                <w:rFonts w:ascii="Bookman Old Style" w:hAnsi="Bookman Old Style" w:cs="Arial"/>
-                              </w:rPr>
-                              <w:t>03 Februari 2026</w:t>
+                              <w:t xml:space="preserve"> </w:t>
+                            </w:r>
+                            <w:r>
+                              <w:rPr>
+                                <w:rFonts w:ascii="Bookman Old Style" w:hAnsi="Bookman Old Style" w:cs="Arial"/>
+                              </w:rPr>
+                              <w:t>{{</w:t>
+                            </w:r>
+                            <w:proofErr w:type="spellStart"/>
+                            <w:r>
+                              <w:rPr>
+                                <w:rFonts w:ascii="Bookman Old Style" w:hAnsi="Bookman Old Style" w:cs="Arial"/>
+                              </w:rPr>
+                              <w:t>sk_date_indo</w:t>
+                            </w:r>
+                            <w:proofErr w:type="spellEnd"/>
+                            <w:r>
+                              <w:rPr>
+                                <w:rFonts w:ascii="Bookman Old Style" w:hAnsi="Bookman Old Style" w:cs="Arial"/>
+                              </w:rPr>
+                              <w:t>}}</w:t>
                             </w:r>
                           </w:p>
                           <w:p>
@@ -1097,6 +1803,7 @@
                               <w:rPr>
                                 <w:rFonts w:ascii="Bookman Old Style" w:hAnsi="Bookman Old Style" w:cs="Arial"/>
                                 <w:b/>
+                                <w:lang w:val="id-ID"/>
                               </w:rPr>
                             </w:pPr>
                             <w:r>
@@ -1105,7 +1812,7 @@
                                 <w:b/>
                                 <w:lang w:val="id-ID"/>
                               </w:rPr>
-                              <w:t>KOKO, S.E., M.M</w:t>
+                              <w:t>{{nama_kepala_uptd}}</w:t>
                             </w:r>
                           </w:p>
                           <w:p>
@@ -1114,14 +1821,27 @@
                               <w:jc w:val="center"/>
                               <w:rPr>
                                 <w:rFonts w:ascii="Bookman Old Style" w:hAnsi="Bookman Old Style" w:cs="Arial"/>
-                                <w:lang w:val="id-ID"/>
                               </w:rPr>
                             </w:pPr>
                             <w:r>
                               <w:rPr>
                                 <w:rFonts w:ascii="Bookman Old Style" w:hAnsi="Bookman Old Style" w:cs="Arial"/>
                               </w:rPr>
-                              <w:t>Pembina</w:t>
+                              <w:t>{{</w:t>
+                            </w:r>
+                            <w:proofErr w:type="spellStart"/>
+                            <w:r>
+                              <w:rPr>
+                                <w:rFonts w:ascii="Bookman Old Style" w:hAnsi="Bookman Old Style" w:cs="Arial"/>
+                              </w:rPr>
+                              <w:t>pangkat_kepala_uptd</w:t>
+                            </w:r>
+                            <w:proofErr w:type="spellEnd"/>
+                            <w:r>
+                              <w:rPr>
+                                <w:rFonts w:ascii="Bookman Old Style" w:hAnsi="Bookman Old Style" w:cs="Arial"/>
+                              </w:rPr>
+                              <w:t>}}</w:t>
                             </w:r>
                           </w:p>
                           <w:p>
@@ -1130,6 +1850,7 @@
                               <w:jc w:val="center"/>
                               <w:rPr>
                                 <w:rFonts w:ascii="Bookman Old Style" w:hAnsi="Bookman Old Style" w:cs="Arial"/>
+                                <w:b/>
                                 <w:lang w:val="id-ID"/>
                               </w:rPr>
                             </w:pPr>
@@ -1144,25 +1865,22 @@
                               <w:rPr>
                                 <w:rFonts w:ascii="Bookman Old Style" w:hAnsi="Bookman Old Style" w:cs="Arial"/>
                               </w:rPr>
-                              <w:t>19</w:t>
+                              <w:t>{{</w:t>
                             </w:r>
+                            <w:proofErr w:type="spellStart"/>
                             <w:r>
                               <w:rPr>
                                 <w:rFonts w:ascii="Bookman Old Style" w:hAnsi="Bookman Old Style" w:cs="Arial"/>
-                                <w:lang w:val="id-ID"/>
-                              </w:rPr>
-                              <w:t>810323 200801 1 004</w:t>
+                              </w:rPr>
+                              <w:t>nip_kepala_uptd</w:t>
                             </w:r>
-                          </w:p>
-                          <w:p>
-                            <w:pPr>
-                              <w:jc w:val="center"/>
-                              <w:rPr>
-                                <w:rFonts w:ascii="Bookman Old Style" w:hAnsi="Bookman Old Style" w:cs="Arial"/>
-                                <w:b/>
-                                <w:lang w:val="id-ID"/>
-                              </w:rPr>
-                            </w:pPr>
+                            <w:proofErr w:type="spellEnd"/>
+                            <w:r>
+                              <w:rPr>
+                                <w:rFonts w:ascii="Bookman Old Style" w:hAnsi="Bookman Old Style" w:cs="Arial"/>
+                              </w:rPr>
+                              <w:t>}}</w:t>
+                            </w:r>
                           </w:p>
                           <w:p>
                             <w:pPr>
@@ -1208,12 +1926,14 @@
                                 <w:rFonts w:ascii="Bookman Old Style" w:hAnsi="Bookman Old Style" w:cs="Arial"/>
                               </w:rPr>
                             </w:pPr>
+                            <w:proofErr w:type="spellStart"/>
                             <w:r>
                               <w:rPr>
                                 <w:rFonts w:ascii="Bookman Old Style" w:hAnsi="Bookman Old Style" w:cs="Arial"/>
                               </w:rPr>
                               <w:t>Penata</w:t>
                             </w:r>
+                            <w:proofErr w:type="spellEnd"/>
                           </w:p>
                           <w:p>
                             <w:pPr>
@@ -1272,11 +1992,11 @@
           </mc:Choice>
           <mc:Fallback>
             <w:pict>
-              <v:shapetype id="_x0000_t202" coordsize="21600,21600" o:spt="202" path="m,l,21600r21600,l21600,xe">
+              <v:shapetype w14:anchorId="5D996689" id="_x0000_t202" coordsize="21600,21600" o:spt="202" path="m,l,21600r21600,l21600,xe">
                 <v:stroke joinstyle="miter"/>
                 <v:path gradientshapeok="t" o:connecttype="rect"/>
               </v:shapetype>
-              <v:shape id="Text Box 4" o:spid="_x0000_s1026" type="#_x0000_t202" style="position:absolute;left:0;text-align:left;margin-left:216.9pt;margin-top:6.6pt;width:262.2pt;height:162.9pt;z-index:251662336;visibility:visible;mso-wrap-style:square;mso-width-percent:0;mso-height-percent:0;mso-wrap-distance-left:9pt;mso-wrap-distance-top:0;mso-wrap-distance-right:9pt;mso-wrap-distance-bottom:0;mso-position-horizontal:absolute;mso-position-horizontal-relative:text;mso-position-vertical:absolute;mso-position-vertical-relative:text;mso-width-percent:0;mso-height-percent:0;mso-width-relative:page;mso-height-relative:page;v-text-anchor:top" o:gfxdata="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" filled="f" stroked="f">
+              <v:shape id="Text Box 4" o:spid="_x0000_s1026" type="#_x0000_t202" style="position:absolute;left:0;text-align:left;margin-left:216.9pt;margin-top:6.6pt;width:262.2pt;height:162.9pt;z-index:251662336;visibility:visible;mso-wrap-style:square;mso-width-percent:0;mso-height-percent:0;mso-wrap-distance-left:9pt;mso-wrap-distance-top:0;mso-wrap-distance-right:9pt;mso-wrap-distance-bottom:0;mso-position-horizontal:absolute;mso-position-horizontal-relative:text;mso-position-vertical:absolute;mso-position-vertical-relative:text;mso-width-percent:0;mso-height-percent:0;mso-width-relative:page;mso-height-relative:page;v-text-anchor:top" o:gfxdata="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" filled="f" stroked="f">
                 <v:textbox>
                   <w:txbxContent>
                     <w:p>
@@ -1295,10 +2015,27 @@
                         <w:t>Cimahi,</w:t>
                       </w:r>
                       <w:r>
-                        <w:rPr>
-                          <w:rFonts w:ascii="Bookman Old Style" w:hAnsi="Bookman Old Style" w:cs="Arial"/>
-                        </w:rPr>
-                        <w:t>03 Februari 2026</w:t>
+                        <w:t xml:space="preserve"> </w:t>
+                      </w:r>
+                      <w:r>
+                        <w:rPr>
+                          <w:rFonts w:ascii="Bookman Old Style" w:hAnsi="Bookman Old Style" w:cs="Arial"/>
+                        </w:rPr>
+                        <w:t>{{</w:t>
+                      </w:r>
+                      <w:proofErr w:type="spellStart"/>
+                      <w:r>
+                        <w:rPr>
+                          <w:rFonts w:ascii="Bookman Old Style" w:hAnsi="Bookman Old Style" w:cs="Arial"/>
+                        </w:rPr>
+                        <w:t>sk_date_indo</w:t>
+                      </w:r>
+                      <w:proofErr w:type="spellEnd"/>
+                      <w:r>
+                        <w:rPr>
+                          <w:rFonts w:ascii="Bookman Old Style" w:hAnsi="Bookman Old Style" w:cs="Arial"/>
+                        </w:rPr>
+                        <w:t>}}</w:t>
                       </w:r>
                     </w:p>
                     <w:p>
@@ -1393,6 +2130,7 @@
                         <w:rPr>
                           <w:rFonts w:ascii="Bookman Old Style" w:hAnsi="Bookman Old Style" w:cs="Arial"/>
                           <w:b/>
+                          <w:lang w:val="id-ID"/>
                         </w:rPr>
                       </w:pPr>
                       <w:r>
@@ -1401,7 +2139,7 @@
                           <w:b/>
                           <w:lang w:val="id-ID"/>
                         </w:rPr>
-                        <w:t>KOKO, S.E., M.M</w:t>
+                        <w:t>{{nama_kepala_uptd}}</w:t>
                       </w:r>
                     </w:p>
                     <w:p>
@@ -1410,14 +2148,27 @@
                         <w:jc w:val="center"/>
                         <w:rPr>
                           <w:rFonts w:ascii="Bookman Old Style" w:hAnsi="Bookman Old Style" w:cs="Arial"/>
-                          <w:lang w:val="id-ID"/>
                         </w:rPr>
                       </w:pPr>
                       <w:r>
                         <w:rPr>
                           <w:rFonts w:ascii="Bookman Old Style" w:hAnsi="Bookman Old Style" w:cs="Arial"/>
                         </w:rPr>
-                        <w:t>Pembina</w:t>
+                        <w:t>{{</w:t>
+                      </w:r>
+                      <w:proofErr w:type="spellStart"/>
+                      <w:r>
+                        <w:rPr>
+                          <w:rFonts w:ascii="Bookman Old Style" w:hAnsi="Bookman Old Style" w:cs="Arial"/>
+                        </w:rPr>
+                        <w:t>pangkat_kepala_uptd</w:t>
+                      </w:r>
+                      <w:proofErr w:type="spellEnd"/>
+                      <w:r>
+                        <w:rPr>
+                          <w:rFonts w:ascii="Bookman Old Style" w:hAnsi="Bookman Old Style" w:cs="Arial"/>
+                        </w:rPr>
+                        <w:t>}}</w:t>
                       </w:r>
                     </w:p>
                     <w:p>
@@ -1426,6 +2177,7 @@
                         <w:jc w:val="center"/>
                         <w:rPr>
                           <w:rFonts w:ascii="Bookman Old Style" w:hAnsi="Bookman Old Style" w:cs="Arial"/>
+                          <w:b/>
                           <w:lang w:val="id-ID"/>
                         </w:rPr>
                       </w:pPr>
@@ -1440,25 +2192,22 @@
                         <w:rPr>
                           <w:rFonts w:ascii="Bookman Old Style" w:hAnsi="Bookman Old Style" w:cs="Arial"/>
                         </w:rPr>
-                        <w:t>19</w:t>
+                        <w:t>{{</w:t>
                       </w:r>
+                      <w:proofErr w:type="spellStart"/>
                       <w:r>
                         <w:rPr>
                           <w:rFonts w:ascii="Bookman Old Style" w:hAnsi="Bookman Old Style" w:cs="Arial"/>
-                          <w:lang w:val="id-ID"/>
-                        </w:rPr>
-                        <w:t>810323 200801 1 004</w:t>
+                        </w:rPr>
+                        <w:t>nip_kepala_uptd</w:t>
                       </w:r>
-                    </w:p>
-                    <w:p>
-                      <w:pPr>
-                        <w:jc w:val="center"/>
-                        <w:rPr>
-                          <w:rFonts w:ascii="Bookman Old Style" w:hAnsi="Bookman Old Style" w:cs="Arial"/>
-                          <w:b/>
-                          <w:lang w:val="id-ID"/>
-                        </w:rPr>
-                      </w:pPr>
+                      <w:proofErr w:type="spellEnd"/>
+                      <w:r>
+                        <w:rPr>
+                          <w:rFonts w:ascii="Bookman Old Style" w:hAnsi="Bookman Old Style" w:cs="Arial"/>
+                        </w:rPr>
+                        <w:t>}}</w:t>
+                      </w:r>
                     </w:p>
                     <w:p>
                       <w:pPr>
@@ -1504,12 +2253,14 @@
                           <w:rFonts w:ascii="Bookman Old Style" w:hAnsi="Bookman Old Style" w:cs="Arial"/>
                         </w:rPr>
                       </w:pPr>
+                      <w:proofErr w:type="spellStart"/>
                       <w:r>
                         <w:rPr>
                           <w:rFonts w:ascii="Bookman Old Style" w:hAnsi="Bookman Old Style" w:cs="Arial"/>
                         </w:rPr>
                         <w:t>Penata</w:t>
                       </w:r>
+                      <w:proofErr w:type="spellEnd"/>
                     </w:p>
                     <w:p>
                       <w:pPr>
@@ -1568,7 +2319,7 @@
       </w:pPr>
     </w:p>
     <w:sectPr>
-      <w:headerReference w:type="default" r:id="rId9"/>
+      <w:headerReference w:type="default" r:id="rId8"/>
       <w:pgSz w:w="11907" w:h="16840" w:code="9"/>
       <w:pgMar w:top="-438" w:right="1134" w:bottom="1701" w:left="1134" w:header="851" w:footer="720" w:gutter="0"/>
       <w:cols w:space="720"/>
@@ -1579,7 +2330,7 @@
 </file>
 
 <file path=word/endnotes.xml><?xml version="1.0" encoding="utf-8"?>
-<w:endnotes xmlns:wpc="http://schemas.microsoft.com/office/word/2010/wordprocessingCanvas" xmlns:mc="http://schemas.openxmlformats.org/markup-compatibility/2006" xmlns:o="urn:schemas-microsoft-com:office:office" xmlns:r="http://schemas.openxmlformats.org/officeDocument/2006/relationships" xmlns:m="http://schemas.openxmlformats.org/officeDocument/2006/math" xmlns:v="urn:schemas-microsoft-com:vml" xmlns:wp14="http://schemas.microsoft.com/office/word/2010/wordprocessingDrawing" xmlns:wp="http://schemas.openxmlformats.org/drawingml/2006/wordprocessingDrawing" xmlns:w10="urn:schemas-microsoft-com:office:word" xmlns:w="http://schemas.openxmlformats.org/wordprocessingml/2006/main" xmlns:w14="http://schemas.microsoft.com/office/word/2010/wordml" xmlns:wpg="http://schemas.microsoft.com/office/word/2010/wordprocessingGroup" xmlns:wpi="http://schemas.microsoft.com/office/word/2010/wordprocessingInk" xmlns:wne="http://schemas.microsoft.com/office/word/2006/wordml" xmlns:wps="http://schemas.microsoft.com/office/word/2010/wordprocessingShape" mc:Ignorable="w14 wp14">
+<w:endnotes xmlns:wpc="http://schemas.microsoft.com/office/word/2010/wordprocessingCanvas" xmlns:cx="http://schemas.microsoft.com/office/drawing/2014/chartex" xmlns:cx1="http://schemas.microsoft.com/office/drawing/2015/9/8/chartex" xmlns:cx2="http://schemas.microsoft.com/office/drawing/2015/10/21/chartex" xmlns:cx3="http://schemas.microsoft.com/office/drawing/2016/5/9/chartex" xmlns:cx4="http://schemas.microsoft.com/office/drawing/2016/5/10/chartex" xmlns:cx5="http://schemas.microsoft.com/office/drawing/2016/5/11/chartex" xmlns:cx6="http://schemas.microsoft.com/office/drawing/2016/5/12/chartex" xmlns:cx7="http://schemas.microsoft.com/office/drawing/2016/5/13/chartex" xmlns:cx8="http://schemas.microsoft.com/office/drawing/2016/5/14/chartex" xmlns:mc="http://schemas.openxmlformats.org/markup-compatibility/2006" xmlns:aink="http://schemas.microsoft.com/office/drawing/2016/ink" xmlns:am3d="http://schemas.microsoft.com/office/drawing/2017/model3d" xmlns:o="urn:schemas-microsoft-com:office:office" xmlns:r="http://schemas.openxmlformats.org/officeDocument/2006/relationships" xmlns:m="http://schemas.openxmlformats.org/officeDocument/2006/math" xmlns:v="urn:schemas-microsoft-com:vml" xmlns:wp14="http://schemas.microsoft.com/office/word/2010/wordprocessingDrawing" xmlns:wp="http://schemas.openxmlformats.org/drawingml/2006/wordprocessingDrawing" xmlns:w10="urn:schemas-microsoft-com:office:word" xmlns:w="http://schemas.openxmlformats.org/wordprocessingml/2006/main" xmlns:w14="http://schemas.microsoft.com/office/word/2010/wordml" xmlns:w15="http://schemas.microsoft.com/office/word/2012/wordml" xmlns:w16cex="http://schemas.microsoft.com/office/word/2018/wordml/cex" xmlns:w16cid="http://schemas.microsoft.com/office/word/2016/wordml/cid" xmlns:w16="http://schemas.microsoft.com/office/word/2018/wordml" xmlns:w16sdtdh="http://schemas.microsoft.com/office/word/2020/wordml/sdtdatahash" xmlns:w16se="http://schemas.microsoft.com/office/word/2015/wordml/symex" xmlns:wpg="http://schemas.microsoft.com/office/word/2010/wordprocessingGroup" xmlns:wpi="http://schemas.microsoft.com/office/word/2010/wordprocessingInk" xmlns:wne="http://schemas.microsoft.com/office/word/2006/wordml" xmlns:wps="http://schemas.microsoft.com/office/word/2010/wordprocessingShape" mc:Ignorable="w14 w15 w16se w16cid w16 w16cex w16sdtdh wp14">
   <w:endnote w:type="separator" w:id="-1">
     <w:p>
       <w:pPr>
@@ -1604,7 +2355,7 @@
 </file>
 
 <file path=word/footnotes.xml><?xml version="1.0" encoding="utf-8"?>
-<w:footnotes xmlns:wpc="http://schemas.microsoft.com/office/word/2010/wordprocessingCanvas" xmlns:mc="http://schemas.openxmlformats.org/markup-compatibility/2006" xmlns:o="urn:schemas-microsoft-com:office:office" xmlns:r="http://schemas.openxmlformats.org/officeDocument/2006/relationships" xmlns:m="http://schemas.openxmlformats.org/officeDocument/2006/math" xmlns:v="urn:schemas-microsoft-com:vml" xmlns:wp14="http://schemas.microsoft.com/office/word/2010/wordprocessingDrawing" xmlns:wp="http://schemas.openxmlformats.org/drawingml/2006/wordprocessingDrawing" xmlns:w10="urn:schemas-microsoft-com:office:word" xmlns:w="http://schemas.openxmlformats.org/wordprocessingml/2006/main" xmlns:w14="http://schemas.microsoft.com/office/word/2010/wordml" xmlns:wpg="http://schemas.microsoft.com/office/word/2010/wordprocessingGroup" xmlns:wpi="http://schemas.microsoft.com/office/word/2010/wordprocessingInk" xmlns:wne="http://schemas.microsoft.com/office/word/2006/wordml" xmlns:wps="http://schemas.microsoft.com/office/word/2010/wordprocessingShape" mc:Ignorable="w14 wp14">
+<w:footnotes xmlns:wpc="http://schemas.microsoft.com/office/word/2010/wordprocessingCanvas" xmlns:cx="http://schemas.microsoft.com/office/drawing/2014/chartex" xmlns:cx1="http://schemas.microsoft.com/office/drawing/2015/9/8/chartex" xmlns:cx2="http://schemas.microsoft.com/office/drawing/2015/10/21/chartex" xmlns:cx3="http://schemas.microsoft.com/office/drawing/2016/5/9/chartex" xmlns:cx4="http://schemas.microsoft.com/office/drawing/2016/5/10/chartex" xmlns:cx5="http://schemas.microsoft.com/office/drawing/2016/5/11/chartex" xmlns:cx6="http://schemas.microsoft.com/office/drawing/2016/5/12/chartex" xmlns:cx7="http://schemas.microsoft.com/office/drawing/2016/5/13/chartex" xmlns:cx8="http://schemas.microsoft.com/office/drawing/2016/5/14/chartex" xmlns:mc="http://schemas.openxmlformats.org/markup-compatibility/2006" xmlns:aink="http://schemas.microsoft.com/office/drawing/2016/ink" xmlns:am3d="http://schemas.microsoft.com/office/drawing/2017/model3d" xmlns:o="urn:schemas-microsoft-com:office:office" xmlns:r="http://schemas.openxmlformats.org/officeDocument/2006/relationships" xmlns:m="http://schemas.openxmlformats.org/officeDocument/2006/math" xmlns:v="urn:schemas-microsoft-com:vml" xmlns:wp14="http://schemas.microsoft.com/office/word/2010/wordprocessingDrawing" xmlns:wp="http://schemas.openxmlformats.org/drawingml/2006/wordprocessingDrawing" xmlns:w10="urn:schemas-microsoft-com:office:word" xmlns:w="http://schemas.openxmlformats.org/wordprocessingml/2006/main" xmlns:w14="http://schemas.microsoft.com/office/word/2010/wordml" xmlns:w15="http://schemas.microsoft.com/office/word/2012/wordml" xmlns:w16cex="http://schemas.microsoft.com/office/word/2018/wordml/cex" xmlns:w16cid="http://schemas.microsoft.com/office/word/2016/wordml/cid" xmlns:w16="http://schemas.microsoft.com/office/word/2018/wordml" xmlns:w16sdtdh="http://schemas.microsoft.com/office/word/2020/wordml/sdtdatahash" xmlns:w16se="http://schemas.microsoft.com/office/word/2015/wordml/symex" xmlns:wpg="http://schemas.microsoft.com/office/word/2010/wordprocessingGroup" xmlns:wpi="http://schemas.microsoft.com/office/word/2010/wordprocessingInk" xmlns:wne="http://schemas.microsoft.com/office/word/2006/wordml" xmlns:wps="http://schemas.microsoft.com/office/word/2010/wordprocessingShape" mc:Ignorable="w14 w15 w16se w16cid w16 w16cex w16sdtdh wp14">
   <w:footnote w:type="separator" w:id="-1">
     <w:p>
       <w:pPr>
@@ -1629,7 +2380,7 @@
 </file>
 
 <file path=word/header1.xml><?xml version="1.0" encoding="utf-8"?>
-<w:hdr xmlns:wpc="http://schemas.microsoft.com/office/word/2010/wordprocessingCanvas" xmlns:mc="http://schemas.openxmlformats.org/markup-compatibility/2006" xmlns:o="urn:schemas-microsoft-com:office:office" xmlns:r="http://schemas.openxmlformats.org/officeDocument/2006/relationships" xmlns:m="http://schemas.openxmlformats.org/officeDocument/2006/math" xmlns:v="urn:schemas-microsoft-com:vml" xmlns:wp14="http://schemas.microsoft.com/office/word/2010/wordprocessingDrawing" xmlns:wp="http://schemas.openxmlformats.org/drawingml/2006/wordprocessingDrawing" xmlns:w10="urn:schemas-microsoft-com:office:word" xmlns:w="http://schemas.openxmlformats.org/wordprocessingml/2006/main" xmlns:w14="http://schemas.microsoft.com/office/word/2010/wordml" xmlns:wpg="http://schemas.microsoft.com/office/word/2010/wordprocessingGroup" xmlns:wpi="http://schemas.microsoft.com/office/word/2010/wordprocessingInk" xmlns:wne="http://schemas.microsoft.com/office/word/2006/wordml" xmlns:wps="http://schemas.microsoft.com/office/word/2010/wordprocessingShape" mc:Ignorable="w14 wp14">
+<w:hdr xmlns:wpc="http://schemas.microsoft.com/office/word/2010/wordprocessingCanvas" xmlns:cx="http://schemas.microsoft.com/office/drawing/2014/chartex" xmlns:cx1="http://schemas.microsoft.com/office/drawing/2015/9/8/chartex" xmlns:cx2="http://schemas.microsoft.com/office/drawing/2015/10/21/chartex" xmlns:cx3="http://schemas.microsoft.com/office/drawing/2016/5/9/chartex" xmlns:cx4="http://schemas.microsoft.com/office/drawing/2016/5/10/chartex" xmlns:cx5="http://schemas.microsoft.com/office/drawing/2016/5/11/chartex" xmlns:cx6="http://schemas.microsoft.com/office/drawing/2016/5/12/chartex" xmlns:cx7="http://schemas.microsoft.com/office/drawing/2016/5/13/chartex" xmlns:cx8="http://schemas.microsoft.com/office/drawing/2016/5/14/chartex" xmlns:mc="http://schemas.openxmlformats.org/markup-compatibility/2006" xmlns:aink="http://schemas.microsoft.com/office/drawing/2016/ink" xmlns:am3d="http://schemas.microsoft.com/office/drawing/2017/model3d" xmlns:o="urn:schemas-microsoft-com:office:office" xmlns:r="http://schemas.openxmlformats.org/officeDocument/2006/relationships" xmlns:m="http://schemas.openxmlformats.org/officeDocument/2006/math" xmlns:v="urn:schemas-microsoft-com:vml" xmlns:wp14="http://schemas.microsoft.com/office/word/2010/wordprocessingDrawing" xmlns:wp="http://schemas.openxmlformats.org/drawingml/2006/wordprocessingDrawing" xmlns:w10="urn:schemas-microsoft-com:office:word" xmlns:w="http://schemas.openxmlformats.org/wordprocessingml/2006/main" xmlns:w14="http://schemas.microsoft.com/office/word/2010/wordml" xmlns:w15="http://schemas.microsoft.com/office/word/2012/wordml" xmlns:w16cex="http://schemas.microsoft.com/office/word/2018/wordml/cex" xmlns:w16cid="http://schemas.microsoft.com/office/word/2016/wordml/cid" xmlns:w16="http://schemas.microsoft.com/office/word/2018/wordml" xmlns:w16sdtdh="http://schemas.microsoft.com/office/word/2020/wordml/sdtdatahash" xmlns:w16se="http://schemas.microsoft.com/office/word/2015/wordml/symex" xmlns:wpg="http://schemas.microsoft.com/office/word/2010/wordprocessingGroup" xmlns:wpi="http://schemas.microsoft.com/office/word/2010/wordprocessingInk" xmlns:wne="http://schemas.microsoft.com/office/word/2006/wordml" xmlns:wps="http://schemas.microsoft.com/office/word/2010/wordprocessingShape" mc:Ignorable="w14 w15 w16se w16cid w16 w16cex w16sdtdh wp14">
   <w:p>
     <w:pPr>
       <w:pStyle w:val="Header"/>
@@ -1643,7 +2394,7 @@
 </file>
 
 <file path=word/styles.xml><?xml version="1.0" encoding="utf-8"?>
-<w:styles xmlns:mc="http://schemas.openxmlformats.org/markup-compatibility/2006" xmlns:r="http://schemas.openxmlformats.org/officeDocument/2006/relationships" xmlns:w="http://schemas.openxmlformats.org/wordprocessingml/2006/main" xmlns:w14="http://schemas.microsoft.com/office/word/2010/wordml" mc:Ignorable="w14">
+<w:styles xmlns:mc="http://schemas.openxmlformats.org/markup-compatibility/2006" xmlns:r="http://schemas.openxmlformats.org/officeDocument/2006/relationships" xmlns:w="http://schemas.openxmlformats.org/wordprocessingml/2006/main" xmlns:w14="http://schemas.microsoft.com/office/word/2010/wordml" xmlns:w15="http://schemas.microsoft.com/office/word/2012/wordml" xmlns:w16cex="http://schemas.microsoft.com/office/word/2018/wordml/cex" xmlns:w16cid="http://schemas.microsoft.com/office/word/2016/wordml/cid" xmlns:w16="http://schemas.microsoft.com/office/word/2018/wordml" xmlns:w16sdtdh="http://schemas.microsoft.com/office/word/2020/wordml/sdtdatahash" xmlns:w16se="http://schemas.microsoft.com/office/word/2015/wordml/symex" mc:Ignorable="w14 w15 w16se w16cid w16 w16cex w16sdtdh">
   <w:docDefaults>
     <w:rPrDefault>
       <w:rPr>
@@ -1659,144 +2410,383 @@
       </w:pPr>
     </w:pPrDefault>
   </w:docDefaults>
-  <w:latentStyles w:defLockedState="0" w:defUIPriority="99" w:defSemiHidden="1" w:defUnhideWhenUsed="1" w:defQFormat="0" w:count="267">
-    <w:lsdException w:name="Normal" w:semiHidden="0" w:uiPriority="0" w:unhideWhenUsed="0" w:qFormat="1"/>
-    <w:lsdException w:name="heading 1" w:semiHidden="0" w:uiPriority="9" w:unhideWhenUsed="0" w:qFormat="1"/>
-    <w:lsdException w:name="heading 2" w:uiPriority="9" w:qFormat="1"/>
-    <w:lsdException w:name="heading 3" w:uiPriority="9" w:qFormat="1"/>
-    <w:lsdException w:name="heading 4" w:uiPriority="9" w:qFormat="1"/>
-    <w:lsdException w:name="heading 5" w:uiPriority="9" w:qFormat="1"/>
-    <w:lsdException w:name="heading 6" w:uiPriority="9" w:qFormat="1"/>
-    <w:lsdException w:name="heading 7" w:uiPriority="9" w:qFormat="1"/>
-    <w:lsdException w:name="heading 8" w:uiPriority="9" w:qFormat="1"/>
-    <w:lsdException w:name="heading 9" w:uiPriority="9" w:qFormat="1"/>
-    <w:lsdException w:name="toc 1" w:uiPriority="39"/>
-    <w:lsdException w:name="toc 2" w:uiPriority="39"/>
-    <w:lsdException w:name="toc 3" w:uiPriority="39"/>
-    <w:lsdException w:name="toc 4" w:uiPriority="39"/>
-    <w:lsdException w:name="toc 5" w:uiPriority="39"/>
-    <w:lsdException w:name="toc 6" w:uiPriority="39"/>
-    <w:lsdException w:name="toc 7" w:uiPriority="39"/>
-    <w:lsdException w:name="toc 8" w:uiPriority="39"/>
-    <w:lsdException w:name="toc 9" w:uiPriority="39"/>
-    <w:lsdException w:name="caption" w:uiPriority="35" w:qFormat="1"/>
-    <w:lsdException w:name="Title" w:semiHidden="0" w:uiPriority="10" w:unhideWhenUsed="0" w:qFormat="1"/>
-    <w:lsdException w:name="Default Paragraph Font" w:uiPriority="1"/>
-    <w:lsdException w:name="Subtitle" w:semiHidden="0" w:uiPriority="11" w:unhideWhenUsed="0" w:qFormat="1"/>
-    <w:lsdException w:name="Strong" w:semiHidden="0" w:uiPriority="22" w:unhideWhenUsed="0" w:qFormat="1"/>
-    <w:lsdException w:name="Emphasis" w:semiHidden="0" w:uiPriority="20" w:unhideWhenUsed="0" w:qFormat="1"/>
-    <w:lsdException w:name="Table Grid" w:semiHidden="0" w:uiPriority="59" w:unhideWhenUsed="0"/>
-    <w:lsdException w:name="Placeholder Text" w:unhideWhenUsed="0"/>
-    <w:lsdException w:name="No Spacing" w:semiHidden="0" w:uiPriority="1" w:unhideWhenUsed="0" w:qFormat="1"/>
-    <w:lsdException w:name="Light Shading" w:semiHidden="0" w:uiPriority="60" w:unhideWhenUsed="0"/>
-    <w:lsdException w:name="Light List" w:semiHidden="0" w:uiPriority="61" w:unhideWhenUsed="0"/>
-    <w:lsdException w:name="Light Grid" w:semiHidden="0" w:uiPriority="62" w:unhideWhenUsed="0"/>
-    <w:lsdException w:name="Medium Shading 1" w:semiHidden="0" w:uiPriority="63" w:unhideWhenUsed="0"/>
-    <w:lsdException w:name="Medium Shading 2" w:semiHidden="0" w:uiPriority="64" w:unhideWhenUsed="0"/>
-    <w:lsdException w:name="Medium List 1" w:semiHidden="0" w:uiPriority="65" w:unhideWhenUsed="0"/>
-    <w:lsdException w:name="Medium List 2" w:semiHidden="0" w:uiPriority="66" w:unhideWhenUsed="0"/>
-    <w:lsdException w:name="Medium Grid 1" w:semiHidden="0" w:uiPriority="67" w:unhideWhenUsed="0"/>
-    <w:lsdException w:name="Medium Grid 2" w:semiHidden="0" w:uiPriority="68" w:unhideWhenUsed="0"/>
-    <w:lsdException w:name="Medium Grid 3" w:semiHidden="0" w:uiPriority="69" w:unhideWhenUsed="0"/>
-    <w:lsdException w:name="Dark List" w:semiHidden="0" w:uiPriority="70" w:unhideWhenUsed="0"/>
-    <w:lsdException w:name="Colorful Shading" w:semiHidden="0" w:uiPriority="71" w:unhideWhenUsed="0"/>
-    <w:lsdException w:name="Colorful List" w:semiHidden="0" w:uiPriority="72" w:unhideWhenUsed="0"/>
-    <w:lsdException w:name="Colorful Grid" w:semiHidden="0" w:uiPriority="73" w:unhideWhenUsed="0"/>
-    <w:lsdException w:name="Light Shading Accent 1" w:semiHidden="0" w:uiPriority="60" w:unhideWhenUsed="0"/>
-    <w:lsdException w:name="Light List Accent 1" w:semiHidden="0" w:uiPriority="61" w:unhideWhenUsed="0"/>
-    <w:lsdException w:name="Light Grid Accent 1" w:semiHidden="0" w:uiPriority="62" w:unhideWhenUsed="0"/>
-    <w:lsdException w:name="Medium Shading 1 Accent 1" w:semiHidden="0" w:uiPriority="63" w:unhideWhenUsed="0"/>
-    <w:lsdException w:name="Medium Shading 2 Accent 1" w:semiHidden="0" w:uiPriority="64" w:unhideWhenUsed="0"/>
-    <w:lsdException w:name="Medium List 1 Accent 1" w:semiHidden="0" w:uiPriority="65" w:unhideWhenUsed="0"/>
-    <w:lsdException w:name="Revision" w:unhideWhenUsed="0"/>
-    <w:lsdException w:name="List Paragraph" w:semiHidden="0" w:uiPriority="34" w:unhideWhenUsed="0" w:qFormat="1"/>
-    <w:lsdException w:name="Quote" w:semiHidden="0" w:uiPriority="29" w:unhideWhenUsed="0" w:qFormat="1"/>
-    <w:lsdException w:name="Intense Quote" w:semiHidden="0" w:uiPriority="30" w:unhideWhenUsed="0" w:qFormat="1"/>
-    <w:lsdException w:name="Medium List 2 Accent 1" w:semiHidden="0" w:uiPriority="66" w:unhideWhenUsed="0"/>
-    <w:lsdException w:name="Medium Grid 1 Accent 1" w:semiHidden="0" w:uiPriority="67" w:unhideWhenUsed="0"/>
-    <w:lsdException w:name="Medium Grid 2 Accent 1" w:semiHidden="0" w:uiPriority="68" w:unhideWhenUsed="0"/>
-    <w:lsdException w:name="Medium Grid 3 Accent 1" w:semiHidden="0" w:uiPriority="69" w:unhideWhenUsed="0"/>
-    <w:lsdException w:name="Dark List Accent 1" w:semiHidden="0" w:uiPriority="70" w:unhideWhenUsed="0"/>
-    <w:lsdException w:name="Colorful Shading Accent 1" w:semiHidden="0" w:uiPriority="71" w:unhideWhenUsed="0"/>
-    <w:lsdException w:name="Colorful List Accent 1" w:semiHidden="0" w:uiPriority="72" w:unhideWhenUsed="0"/>
-    <w:lsdException w:name="Colorful Grid Accent 1" w:semiHidden="0" w:uiPriority="73" w:unhideWhenUsed="0"/>
-    <w:lsdException w:name="Light Shading Accent 2" w:semiHidden="0" w:uiPriority="60" w:unhideWhenUsed="0"/>
-    <w:lsdException w:name="Light List Accent 2" w:semiHidden="0" w:uiPriority="61" w:unhideWhenUsed="0"/>
-    <w:lsdException w:name="Light Grid Accent 2" w:semiHidden="0" w:uiPriority="62" w:unhideWhenUsed="0"/>
-    <w:lsdException w:name="Medium Shading 1 Accent 2" w:semiHidden="0" w:uiPriority="63" w:unhideWhenUsed="0"/>
-    <w:lsdException w:name="Medium Shading 2 Accent 2" w:semiHidden="0" w:uiPriority="64" w:unhideWhenUsed="0"/>
-    <w:lsdException w:name="Medium List 1 Accent 2" w:semiHidden="0" w:uiPriority="65" w:unhideWhenUsed="0"/>
-    <w:lsdException w:name="Medium List 2 Accent 2" w:semiHidden="0" w:uiPriority="66" w:unhideWhenUsed="0"/>
-    <w:lsdException w:name="Medium Grid 1 Accent 2" w:semiHidden="0" w:uiPriority="67" w:unhideWhenUsed="0"/>
-    <w:lsdException w:name="Medium Grid 2 Accent 2" w:semiHidden="0" w:uiPriority="68" w:unhideWhenUsed="0"/>
-    <w:lsdException w:name="Medium Grid 3 Accent 2" w:semiHidden="0" w:uiPriority="69" w:unhideWhenUsed="0"/>
-    <w:lsdException w:name="Dark List Accent 2" w:semiHidden="0" w:uiPriority="70" w:unhideWhenUsed="0"/>
-    <w:lsdException w:name="Colorful Shading Accent 2" w:semiHidden="0" w:uiPriority="71" w:unhideWhenUsed="0"/>
-    <w:lsdException w:name="Colorful List Accent 2" w:semiHidden="0" w:uiPriority="72" w:unhideWhenUsed="0"/>
-    <w:lsdException w:name="Colorful Grid Accent 2" w:semiHidden="0" w:uiPriority="73" w:unhideWhenUsed="0"/>
-    <w:lsdException w:name="Light Shading Accent 3" w:semiHidden="0" w:uiPriority="60" w:unhideWhenUsed="0"/>
-    <w:lsdException w:name="Light List Accent 3" w:semiHidden="0" w:uiPriority="61" w:unhideWhenUsed="0"/>
-    <w:lsdException w:name="Light Grid Accent 3" w:semiHidden="0" w:uiPriority="62" w:unhideWhenUsed="0"/>
-    <w:lsdException w:name="Medium Shading 1 Accent 3" w:semiHidden="0" w:uiPriority="63" w:unhideWhenUsed="0"/>
-    <w:lsdException w:name="Medium Shading 2 Accent 3" w:semiHidden="0" w:uiPriority="64" w:unhideWhenUsed="0"/>
-    <w:lsdException w:name="Medium List 1 Accent 3" w:semiHidden="0" w:uiPriority="65" w:unhideWhenUsed="0"/>
-    <w:lsdException w:name="Medium List 2 Accent 3" w:semiHidden="0" w:uiPriority="66" w:unhideWhenUsed="0"/>
-    <w:lsdException w:name="Medium Grid 1 Accent 3" w:semiHidden="0" w:uiPriority="67" w:unhideWhenUsed="0"/>
-    <w:lsdException w:name="Medium Grid 2 Accent 3" w:semiHidden="0" w:uiPriority="68" w:unhideWhenUsed="0"/>
-    <w:lsdException w:name="Medium Grid 3 Accent 3" w:semiHidden="0" w:uiPriority="69" w:unhideWhenUsed="0"/>
-    <w:lsdException w:name="Dark List Accent 3" w:semiHidden="0" w:uiPriority="70" w:unhideWhenUsed="0"/>
-    <w:lsdException w:name="Colorful Shading Accent 3" w:semiHidden="0" w:uiPriority="71" w:unhideWhenUsed="0"/>
-    <w:lsdException w:name="Colorful List Accent 3" w:semiHidden="0" w:uiPriority="72" w:unhideWhenUsed="0"/>
-    <w:lsdException w:name="Colorful Grid Accent 3" w:semiHidden="0" w:uiPriority="73" w:unhideWhenUsed="0"/>
-    <w:lsdException w:name="Light Shading Accent 4" w:semiHidden="0" w:uiPriority="60" w:unhideWhenUsed="0"/>
-    <w:lsdException w:name="Light List Accent 4" w:semiHidden="0" w:uiPriority="61" w:unhideWhenUsed="0"/>
-    <w:lsdException w:name="Light Grid Accent 4" w:semiHidden="0" w:uiPriority="62" w:unhideWhenUsed="0"/>
-    <w:lsdException w:name="Medium Shading 1 Accent 4" w:semiHidden="0" w:uiPriority="63" w:unhideWhenUsed="0"/>
-    <w:lsdException w:name="Medium Shading 2 Accent 4" w:semiHidden="0" w:uiPriority="64" w:unhideWhenUsed="0"/>
-    <w:lsdException w:name="Medium List 1 Accent 4" w:semiHidden="0" w:uiPriority="65" w:unhideWhenUsed="0"/>
-    <w:lsdException w:name="Medium List 2 Accent 4" w:semiHidden="0" w:uiPriority="66" w:unhideWhenUsed="0"/>
-    <w:lsdException w:name="Medium Grid 1 Accent 4" w:semiHidden="0" w:uiPriority="67" w:unhideWhenUsed="0"/>
-    <w:lsdException w:name="Medium Grid 2 Accent 4" w:semiHidden="0" w:uiPriority="68" w:unhideWhenUsed="0"/>
-    <w:lsdException w:name="Medium Grid 3 Accent 4" w:semiHidden="0" w:uiPriority="69" w:unhideWhenUsed="0"/>
-    <w:lsdException w:name="Dark List Accent 4" w:semiHidden="0" w:uiPriority="70" w:unhideWhenUsed="0"/>
-    <w:lsdException w:name="Colorful Shading Accent 4" w:semiHidden="0" w:uiPriority="71" w:unhideWhenUsed="0"/>
-    <w:lsdException w:name="Colorful List Accent 4" w:semiHidden="0" w:uiPriority="72" w:unhideWhenUsed="0"/>
-    <w:lsdException w:name="Colorful Grid Accent 4" w:semiHidden="0" w:uiPriority="73" w:unhideWhenUsed="0"/>
-    <w:lsdException w:name="Light Shading Accent 5" w:semiHidden="0" w:uiPriority="60" w:unhideWhenUsed="0"/>
-    <w:lsdException w:name="Light List Accent 5" w:semiHidden="0" w:uiPriority="61" w:unhideWhenUsed="0"/>
-    <w:lsdException w:name="Light Grid Accent 5" w:semiHidden="0" w:uiPriority="62" w:unhideWhenUsed="0"/>
-    <w:lsdException w:name="Medium Shading 1 Accent 5" w:semiHidden="0" w:uiPriority="63" w:unhideWhenUsed="0"/>
-    <w:lsdException w:name="Medium Shading 2 Accent 5" w:semiHidden="0" w:uiPriority="64" w:unhideWhenUsed="0"/>
-    <w:lsdException w:name="Medium List 1 Accent 5" w:semiHidden="0" w:uiPriority="65" w:unhideWhenUsed="0"/>
-    <w:lsdException w:name="Medium List 2 Accent 5" w:semiHidden="0" w:uiPriority="66" w:unhideWhenUsed="0"/>
-    <w:lsdException w:name="Medium Grid 1 Accent 5" w:semiHidden="0" w:uiPriority="67" w:unhideWhenUsed="0"/>
-    <w:lsdException w:name="Medium Grid 2 Accent 5" w:semiHidden="0" w:uiPriority="68" w:unhideWhenUsed="0"/>
-    <w:lsdException w:name="Medium Grid 3 Accent 5" w:semiHidden="0" w:uiPriority="69" w:unhideWhenUsed="0"/>
-    <w:lsdException w:name="Dark List Accent 5" w:semiHidden="0" w:uiPriority="70" w:unhideWhenUsed="0"/>
-    <w:lsdException w:name="Colorful Shading Accent 5" w:semiHidden="0" w:uiPriority="71" w:unhideWhenUsed="0"/>
-    <w:lsdException w:name="Colorful List Accent 5" w:semiHidden="0" w:uiPriority="72" w:unhideWhenUsed="0"/>
-    <w:lsdException w:name="Colorful Grid Accent 5" w:semiHidden="0" w:uiPriority="73" w:unhideWhenUsed="0"/>
-    <w:lsdException w:name="Light Shading Accent 6" w:semiHidden="0" w:uiPriority="60" w:unhideWhenUsed="0"/>
-    <w:lsdException w:name="Light List Accent 6" w:semiHidden="0" w:uiPriority="61" w:unhideWhenUsed="0"/>
-    <w:lsdException w:name="Light Grid Accent 6" w:semiHidden="0" w:uiPriority="62" w:unhideWhenUsed="0"/>
-    <w:lsdException w:name="Medium Shading 1 Accent 6" w:semiHidden="0" w:uiPriority="63" w:unhideWhenUsed="0"/>
-    <w:lsdException w:name="Medium Shading 2 Accent 6" w:semiHidden="0" w:uiPriority="64" w:unhideWhenUsed="0"/>
-    <w:lsdException w:name="Medium List 1 Accent 6" w:semiHidden="0" w:uiPriority="65" w:unhideWhenUsed="0"/>
-    <w:lsdException w:name="Medium List 2 Accent 6" w:semiHidden="0" w:uiPriority="66" w:unhideWhenUsed="0"/>
-    <w:lsdException w:name="Medium Grid 1 Accent 6" w:semiHidden="0" w:uiPriority="67" w:unhideWhenUsed="0"/>
-    <w:lsdException w:name="Medium Grid 2 Accent 6" w:semiHidden="0" w:uiPriority="68" w:unhideWhenUsed="0"/>
-    <w:lsdException w:name="Medium Grid 3 Accent 6" w:semiHidden="0" w:uiPriority="69" w:unhideWhenUsed="0"/>
-    <w:lsdException w:name="Dark List Accent 6" w:semiHidden="0" w:uiPriority="70" w:unhideWhenUsed="0"/>
-    <w:lsdException w:name="Colorful Shading Accent 6" w:semiHidden="0" w:uiPriority="71" w:unhideWhenUsed="0"/>
-    <w:lsdException w:name="Colorful List Accent 6" w:semiHidden="0" w:uiPriority="72" w:unhideWhenUsed="0"/>
-    <w:lsdException w:name="Colorful Grid Accent 6" w:semiHidden="0" w:uiPriority="73" w:unhideWhenUsed="0"/>
-    <w:lsdException w:name="Subtle Emphasis" w:semiHidden="0" w:uiPriority="19" w:unhideWhenUsed="0" w:qFormat="1"/>
-    <w:lsdException w:name="Intense Emphasis" w:semiHidden="0" w:uiPriority="21" w:unhideWhenUsed="0" w:qFormat="1"/>
-    <w:lsdException w:name="Subtle Reference" w:semiHidden="0" w:uiPriority="31" w:unhideWhenUsed="0" w:qFormat="1"/>
-    <w:lsdException w:name="Intense Reference" w:semiHidden="0" w:uiPriority="32" w:unhideWhenUsed="0" w:qFormat="1"/>
-    <w:lsdException w:name="Book Title" w:semiHidden="0" w:uiPriority="33" w:unhideWhenUsed="0" w:qFormat="1"/>
-    <w:lsdException w:name="Bibliography" w:uiPriority="37"/>
-    <w:lsdException w:name="TOC Heading" w:uiPriority="39" w:qFormat="1"/>
+  <w:latentStyles w:defLockedState="0" w:defUIPriority="99" w:defSemiHidden="0" w:defUnhideWhenUsed="0" w:defQFormat="0" w:count="376">
+    <w:lsdException w:name="Normal" w:uiPriority="0" w:qFormat="1"/>
+    <w:lsdException w:name="heading 1" w:uiPriority="9" w:qFormat="1"/>
+    <w:lsdException w:name="heading 2" w:semiHidden="1" w:uiPriority="9" w:unhideWhenUsed="1" w:qFormat="1"/>
+    <w:lsdException w:name="heading 3" w:semiHidden="1" w:uiPriority="9" w:unhideWhenUsed="1" w:qFormat="1"/>
+    <w:lsdException w:name="heading 4" w:semiHidden="1" w:uiPriority="9" w:unhideWhenUsed="1" w:qFormat="1"/>
+    <w:lsdException w:name="heading 5" w:semiHidden="1" w:uiPriority="9" w:unhideWhenUsed="1" w:qFormat="1"/>
+    <w:lsdException w:name="heading 6" w:semiHidden="1" w:uiPriority="9" w:unhideWhenUsed="1" w:qFormat="1"/>
+    <w:lsdException w:name="heading 7" w:semiHidden="1" w:uiPriority="9" w:unhideWhenUsed="1" w:qFormat="1"/>
+    <w:lsdException w:name="heading 8" w:semiHidden="1" w:uiPriority="9" w:unhideWhenUsed="1" w:qFormat="1"/>
+    <w:lsdException w:name="heading 9" w:semiHidden="1" w:uiPriority="9" w:unhideWhenUsed="1" w:qFormat="1"/>
+    <w:lsdException w:name="index 1" w:semiHidden="1" w:unhideWhenUsed="1"/>
+    <w:lsdException w:name="index 2" w:semiHidden="1" w:unhideWhenUsed="1"/>
+    <w:lsdException w:name="index 3" w:semiHidden="1" w:unhideWhenUsed="1"/>
+    <w:lsdException w:name="index 4" w:semiHidden="1" w:unhideWhenUsed="1"/>
+    <w:lsdException w:name="index 5" w:semiHidden="1" w:unhideWhenUsed="1"/>
+    <w:lsdException w:name="index 6" w:semiHidden="1" w:unhideWhenUsed="1"/>
+    <w:lsdException w:name="index 7" w:semiHidden="1" w:unhideWhenUsed="1"/>
+    <w:lsdException w:name="index 8" w:semiHidden="1" w:unhideWhenUsed="1"/>
+    <w:lsdException w:name="index 9" w:semiHidden="1" w:unhideWhenUsed="1"/>
+    <w:lsdException w:name="toc 1" w:semiHidden="1" w:uiPriority="39" w:unhideWhenUsed="1"/>
+    <w:lsdException w:name="toc 2" w:semiHidden="1" w:uiPriority="39" w:unhideWhenUsed="1"/>
+    <w:lsdException w:name="toc 3" w:semiHidden="1" w:uiPriority="39" w:unhideWhenUsed="1"/>
+    <w:lsdException w:name="toc 4" w:semiHidden="1" w:uiPriority="39" w:unhideWhenUsed="1"/>
+    <w:lsdException w:name="toc 5" w:semiHidden="1" w:uiPriority="39" w:unhideWhenUsed="1"/>
+    <w:lsdException w:name="toc 6" w:semiHidden="1" w:uiPriority="39" w:unhideWhenUsed="1"/>
+    <w:lsdException w:name="toc 7" w:semiHidden="1" w:uiPriority="39" w:unhideWhenUsed="1"/>
+    <w:lsdException w:name="toc 8" w:semiHidden="1" w:uiPriority="39" w:unhideWhenUsed="1"/>
+    <w:lsdException w:name="toc 9" w:semiHidden="1" w:uiPriority="39" w:unhideWhenUsed="1"/>
+    <w:lsdException w:name="Normal Indent" w:semiHidden="1" w:unhideWhenUsed="1"/>
+    <w:lsdException w:name="footnote text" w:semiHidden="1" w:unhideWhenUsed="1"/>
+    <w:lsdException w:name="annotation text" w:semiHidden="1" w:unhideWhenUsed="1"/>
+    <w:lsdException w:name="header" w:semiHidden="1" w:unhideWhenUsed="1"/>
+    <w:lsdException w:name="footer" w:semiHidden="1" w:unhideWhenUsed="1"/>
+    <w:lsdException w:name="index heading" w:semiHidden="1" w:unhideWhenUsed="1"/>
+    <w:lsdException w:name="caption" w:semiHidden="1" w:uiPriority="35" w:unhideWhenUsed="1" w:qFormat="1"/>
+    <w:lsdException w:name="table of figures" w:semiHidden="1" w:unhideWhenUsed="1"/>
+    <w:lsdException w:name="envelope address" w:semiHidden="1" w:unhideWhenUsed="1"/>
+    <w:lsdException w:name="envelope return" w:semiHidden="1" w:unhideWhenUsed="1"/>
+    <w:lsdException w:name="footnote reference" w:semiHidden="1" w:unhideWhenUsed="1"/>
+    <w:lsdException w:name="annotation reference" w:semiHidden="1" w:unhideWhenUsed="1"/>
+    <w:lsdException w:name="line number" w:semiHidden="1" w:unhideWhenUsed="1"/>
+    <w:lsdException w:name="page number" w:semiHidden="1" w:unhideWhenUsed="1"/>
+    <w:lsdException w:name="endnote reference" w:semiHidden="1" w:unhideWhenUsed="1"/>
+    <w:lsdException w:name="endnote text" w:semiHidden="1" w:unhideWhenUsed="1"/>
+    <w:lsdException w:name="table of authorities" w:semiHidden="1" w:unhideWhenUsed="1"/>
+    <w:lsdException w:name="macro" w:semiHidden="1" w:unhideWhenUsed="1"/>
+    <w:lsdException w:name="toa heading" w:semiHidden="1" w:unhideWhenUsed="1"/>
+    <w:lsdException w:name="List" w:semiHidden="1" w:unhideWhenUsed="1"/>
+    <w:lsdException w:name="List Bullet" w:semiHidden="1" w:unhideWhenUsed="1"/>
+    <w:lsdException w:name="List Number" w:semiHidden="1" w:unhideWhenUsed="1"/>
+    <w:lsdException w:name="List 2" w:semiHidden="1" w:unhideWhenUsed="1"/>
+    <w:lsdException w:name="List 3" w:semiHidden="1" w:unhideWhenUsed="1"/>
+    <w:lsdException w:name="List 4" w:semiHidden="1" w:unhideWhenUsed="1"/>
+    <w:lsdException w:name="List 5" w:semiHidden="1" w:unhideWhenUsed="1"/>
+    <w:lsdException w:name="List Bullet 2" w:semiHidden="1" w:unhideWhenUsed="1"/>
+    <w:lsdException w:name="List Bullet 3" w:semiHidden="1" w:unhideWhenUsed="1"/>
+    <w:lsdException w:name="List Bullet 4" w:semiHidden="1" w:unhideWhenUsed="1"/>
+    <w:lsdException w:name="List Bullet 5" w:semiHidden="1" w:unhideWhenUsed="1"/>
+    <w:lsdException w:name="List Number 2" w:semiHidden="1" w:unhideWhenUsed="1"/>
+    <w:lsdException w:name="List Number 3" w:semiHidden="1" w:unhideWhenUsed="1"/>
+    <w:lsdException w:name="List Number 4" w:semiHidden="1" w:unhideWhenUsed="1"/>
+    <w:lsdException w:name="List Number 5" w:semiHidden="1" w:unhideWhenUsed="1"/>
+    <w:lsdException w:name="Title" w:uiPriority="10" w:qFormat="1"/>
+    <w:lsdException w:name="Closing" w:semiHidden="1" w:unhideWhenUsed="1"/>
+    <w:lsdException w:name="Signature" w:semiHidden="1" w:unhideWhenUsed="1"/>
+    <w:lsdException w:name="Default Paragraph Font" w:semiHidden="1" w:uiPriority="1" w:unhideWhenUsed="1"/>
+    <w:lsdException w:name="Body Text" w:semiHidden="1" w:unhideWhenUsed="1"/>
+    <w:lsdException w:name="Body Text Indent" w:semiHidden="1" w:unhideWhenUsed="1"/>
+    <w:lsdException w:name="List Continue" w:semiHidden="1" w:unhideWhenUsed="1"/>
+    <w:lsdException w:name="List Continue 2" w:semiHidden="1" w:unhideWhenUsed="1"/>
+    <w:lsdException w:name="List Continue 3" w:semiHidden="1" w:unhideWhenUsed="1"/>
+    <w:lsdException w:name="List Continue 4" w:semiHidden="1" w:unhideWhenUsed="1"/>
+    <w:lsdException w:name="List Continue 5" w:semiHidden="1" w:unhideWhenUsed="1"/>
+    <w:lsdException w:name="Message Header" w:semiHidden="1" w:unhideWhenUsed="1"/>
+    <w:lsdException w:name="Subtitle" w:uiPriority="11" w:qFormat="1"/>
+    <w:lsdException w:name="Salutation" w:semiHidden="1" w:unhideWhenUsed="1"/>
+    <w:lsdException w:name="Date" w:semiHidden="1" w:unhideWhenUsed="1"/>
+    <w:lsdException w:name="Body Text First Indent" w:semiHidden="1" w:unhideWhenUsed="1"/>
+    <w:lsdException w:name="Body Text First Indent 2" w:semiHidden="1" w:unhideWhenUsed="1"/>
+    <w:lsdException w:name="Note Heading" w:semiHidden="1" w:unhideWhenUsed="1"/>
+    <w:lsdException w:name="Body Text 2" w:semiHidden="1" w:unhideWhenUsed="1"/>
+    <w:lsdException w:name="Body Text 3" w:semiHidden="1" w:unhideWhenUsed="1"/>
+    <w:lsdException w:name="Body Text Indent 2" w:semiHidden="1" w:unhideWhenUsed="1"/>
+    <w:lsdException w:name="Body Text Indent 3" w:semiHidden="1" w:unhideWhenUsed="1"/>
+    <w:lsdException w:name="Block Text" w:semiHidden="1" w:unhideWhenUsed="1"/>
+    <w:lsdException w:name="Hyperlink" w:semiHidden="1" w:unhideWhenUsed="1"/>
+    <w:lsdException w:name="FollowedHyperlink" w:semiHidden="1" w:unhideWhenUsed="1"/>
+    <w:lsdException w:name="Strong" w:uiPriority="22" w:qFormat="1"/>
+    <w:lsdException w:name="Emphasis" w:uiPriority="20" w:qFormat="1"/>
+    <w:lsdException w:name="Document Map" w:semiHidden="1" w:unhideWhenUsed="1"/>
+    <w:lsdException w:name="Plain Text" w:semiHidden="1" w:unhideWhenUsed="1"/>
+    <w:lsdException w:name="E-mail Signature" w:semiHidden="1" w:unhideWhenUsed="1"/>
+    <w:lsdException w:name="HTML Top of Form" w:semiHidden="1" w:unhideWhenUsed="1"/>
+    <w:lsdException w:name="HTML Bottom of Form" w:semiHidden="1" w:unhideWhenUsed="1"/>
+    <w:lsdException w:name="Normal (Web)" w:semiHidden="1" w:unhideWhenUsed="1"/>
+    <w:lsdException w:name="HTML Acronym" w:semiHidden="1" w:unhideWhenUsed="1"/>
+    <w:lsdException w:name="HTML Address" w:semiHidden="1" w:unhideWhenUsed="1"/>
+    <w:lsdException w:name="HTML Cite" w:semiHidden="1" w:unhideWhenUsed="1"/>
+    <w:lsdException w:name="HTML Code" w:semiHidden="1" w:unhideWhenUsed="1"/>
+    <w:lsdException w:name="HTML Definition" w:semiHidden="1" w:unhideWhenUsed="1"/>
+    <w:lsdException w:name="HTML Keyboard" w:semiHidden="1" w:unhideWhenUsed="1"/>
+    <w:lsdException w:name="HTML Preformatted" w:semiHidden="1" w:unhideWhenUsed="1"/>
+    <w:lsdException w:name="HTML Sample" w:semiHidden="1" w:unhideWhenUsed="1"/>
+    <w:lsdException w:name="HTML Typewriter" w:semiHidden="1" w:unhideWhenUsed="1"/>
+    <w:lsdException w:name="HTML Variable" w:semiHidden="1" w:unhideWhenUsed="1"/>
+    <w:lsdException w:name="Normal Table" w:semiHidden="1" w:unhideWhenUsed="1"/>
+    <w:lsdException w:name="annotation subject" w:semiHidden="1" w:unhideWhenUsed="1"/>
+    <w:lsdException w:name="No List" w:semiHidden="1" w:unhideWhenUsed="1"/>
+    <w:lsdException w:name="Outline List 1" w:semiHidden="1" w:unhideWhenUsed="1"/>
+    <w:lsdException w:name="Outline List 2" w:semiHidden="1" w:unhideWhenUsed="1"/>
+    <w:lsdException w:name="Outline List 3" w:semiHidden="1" w:unhideWhenUsed="1"/>
+    <w:lsdException w:name="Table Simple 1" w:semiHidden="1" w:unhideWhenUsed="1"/>
+    <w:lsdException w:name="Table Simple 2" w:semiHidden="1" w:unhideWhenUsed="1"/>
+    <w:lsdException w:name="Table Simple 3" w:semiHidden="1" w:unhideWhenUsed="1"/>
+    <w:lsdException w:name="Table Classic 1" w:semiHidden="1" w:unhideWhenUsed="1"/>
+    <w:lsdException w:name="Table Classic 2" w:semiHidden="1" w:unhideWhenUsed="1"/>
+    <w:lsdException w:name="Table Classic 3" w:semiHidden="1" w:unhideWhenUsed="1"/>
+    <w:lsdException w:name="Table Classic 4" w:semiHidden="1" w:unhideWhenUsed="1"/>
+    <w:lsdException w:name="Table Colorful 1" w:semiHidden="1" w:unhideWhenUsed="1"/>
+    <w:lsdException w:name="Table Colorful 2" w:semiHidden="1" w:unhideWhenUsed="1"/>
+    <w:lsdException w:name="Table Colorful 3" w:semiHidden="1" w:unhideWhenUsed="1"/>
+    <w:lsdException w:name="Table Columns 1" w:semiHidden="1" w:unhideWhenUsed="1"/>
+    <w:lsdException w:name="Table Columns 2" w:semiHidden="1" w:unhideWhenUsed="1"/>
+    <w:lsdException w:name="Table Columns 3" w:semiHidden="1" w:unhideWhenUsed="1"/>
+    <w:lsdException w:name="Table Columns 4" w:semiHidden="1" w:unhideWhenUsed="1"/>
+    <w:lsdException w:name="Table Columns 5" w:semiHidden="1" w:unhideWhenUsed="1"/>
+    <w:lsdException w:name="Table Grid 1" w:semiHidden="1" w:unhideWhenUsed="1"/>
+    <w:lsdException w:name="Table Grid 2" w:semiHidden="1" w:unhideWhenUsed="1"/>
+    <w:lsdException w:name="Table Grid 3" w:semiHidden="1" w:unhideWhenUsed="1"/>
+    <w:lsdException w:name="Table Grid 4" w:semiHidden="1" w:unhideWhenUsed="1"/>
+    <w:lsdException w:name="Table Grid 5" w:semiHidden="1" w:unhideWhenUsed="1"/>
+    <w:lsdException w:name="Table Grid 6" w:semiHidden="1" w:unhideWhenUsed="1"/>
+    <w:lsdException w:name="Table Grid 7" w:semiHidden="1" w:unhideWhenUsed="1"/>
+    <w:lsdException w:name="Table Grid 8" w:semiHidden="1" w:unhideWhenUsed="1"/>
+    <w:lsdException w:name="Table List 1" w:semiHidden="1" w:unhideWhenUsed="1"/>
+    <w:lsdException w:name="Table List 2" w:semiHidden="1" w:unhideWhenUsed="1"/>
+    <w:lsdException w:name="Table List 3" w:semiHidden="1" w:unhideWhenUsed="1"/>
+    <w:lsdException w:name="Table List 4" w:semiHidden="1" w:unhideWhenUsed="1"/>
+    <w:lsdException w:name="Table List 5" w:semiHidden="1" w:unhideWhenUsed="1"/>
+    <w:lsdException w:name="Table List 6" w:semiHidden="1" w:unhideWhenUsed="1"/>
+    <w:lsdException w:name="Table List 7" w:semiHidden="1" w:unhideWhenUsed="1"/>
+    <w:lsdException w:name="Table List 8" w:semiHidden="1" w:unhideWhenUsed="1"/>
+    <w:lsdException w:name="Table 3D effects 1" w:semiHidden="1" w:unhideWhenUsed="1"/>
+    <w:lsdException w:name="Table 3D effects 2" w:semiHidden="1" w:unhideWhenUsed="1"/>
+    <w:lsdException w:name="Table 3D effects 3" w:semiHidden="1" w:unhideWhenUsed="1"/>
+    <w:lsdException w:name="Table Contemporary" w:semiHidden="1" w:unhideWhenUsed="1"/>
+    <w:lsdException w:name="Table Elegant" w:semiHidden="1" w:unhideWhenUsed="1"/>
+    <w:lsdException w:name="Table Professional" w:semiHidden="1" w:unhideWhenUsed="1"/>
+    <w:lsdException w:name="Table Subtle 1" w:semiHidden="1" w:unhideWhenUsed="1"/>
+    <w:lsdException w:name="Table Subtle 2" w:semiHidden="1" w:unhideWhenUsed="1"/>
+    <w:lsdException w:name="Table Web 1" w:semiHidden="1" w:unhideWhenUsed="1"/>
+    <w:lsdException w:name="Table Web 2" w:semiHidden="1" w:unhideWhenUsed="1"/>
+    <w:lsdException w:name="Table Web 3" w:semiHidden="1" w:unhideWhenUsed="1"/>
+    <w:lsdException w:name="Balloon Text" w:semiHidden="1" w:unhideWhenUsed="1"/>
+    <w:lsdException w:name="Table Grid" w:semiHidden="1" w:uiPriority="59" w:unhideWhenUsed="1"/>
+    <w:lsdException w:name="Table Theme" w:semiHidden="1" w:unhideWhenUsed="1"/>
+    <w:lsdException w:name="Placeholder Text" w:semiHidden="1"/>
+    <w:lsdException w:name="No Spacing" w:uiPriority="1" w:qFormat="1"/>
+    <w:lsdException w:name="Light Shading" w:uiPriority="60"/>
+    <w:lsdException w:name="Light List" w:uiPriority="61"/>
+    <w:lsdException w:name="Light Grid" w:uiPriority="62"/>
+    <w:lsdException w:name="Medium Shading 1" w:uiPriority="63"/>
+    <w:lsdException w:name="Medium Shading 2" w:uiPriority="64"/>
+    <w:lsdException w:name="Medium List 1" w:uiPriority="65"/>
+    <w:lsdException w:name="Medium List 2" w:uiPriority="66"/>
+    <w:lsdException w:name="Medium Grid 1" w:uiPriority="67"/>
+    <w:lsdException w:name="Medium Grid 2" w:uiPriority="68"/>
+    <w:lsdException w:name="Medium Grid 3" w:uiPriority="69"/>
+    <w:lsdException w:name="Dark List" w:uiPriority="70"/>
+    <w:lsdException w:name="Colorful Shading" w:uiPriority="71"/>
+    <w:lsdException w:name="Colorful List" w:uiPriority="72"/>
+    <w:lsdException w:name="Colorful Grid" w:uiPriority="73"/>
+    <w:lsdException w:name="Light Shading Accent 1" w:uiPriority="60"/>
+    <w:lsdException w:name="Light List Accent 1" w:uiPriority="61"/>
+    <w:lsdException w:name="Light Grid Accent 1" w:uiPriority="62"/>
+    <w:lsdException w:name="Medium Shading 1 Accent 1" w:uiPriority="63"/>
+    <w:lsdException w:name="Medium Shading 2 Accent 1" w:uiPriority="64"/>
+    <w:lsdException w:name="Medium List 1 Accent 1" w:uiPriority="65"/>
+    <w:lsdException w:name="Revision" w:semiHidden="1"/>
+    <w:lsdException w:name="List Paragraph" w:uiPriority="34" w:qFormat="1"/>
+    <w:lsdException w:name="Quote" w:uiPriority="29" w:qFormat="1"/>
+    <w:lsdException w:name="Intense Quote" w:uiPriority="30" w:qFormat="1"/>
+    <w:lsdException w:name="Medium List 2 Accent 1" w:uiPriority="66"/>
+    <w:lsdException w:name="Medium Grid 1 Accent 1" w:uiPriority="67"/>
+    <w:lsdException w:name="Medium Grid 2 Accent 1" w:uiPriority="68"/>
+    <w:lsdException w:name="Medium Grid 3 Accent 1" w:uiPriority="69"/>
+    <w:lsdException w:name="Dark List Accent 1" w:uiPriority="70"/>
+    <w:lsdException w:name="Colorful Shading Accent 1" w:uiPriority="71"/>
+    <w:lsdException w:name="Colorful List Accent 1" w:uiPriority="72"/>
+    <w:lsdException w:name="Colorful Grid Accent 1" w:uiPriority="73"/>
+    <w:lsdException w:name="Light Shading Accent 2" w:uiPriority="60"/>
+    <w:lsdException w:name="Light List Accent 2" w:uiPriority="61"/>
+    <w:lsdException w:name="Light Grid Accent 2" w:uiPriority="62"/>
+    <w:lsdException w:name="Medium Shading 1 Accent 2" w:uiPriority="63"/>
+    <w:lsdException w:name="Medium Shading 2 Accent 2" w:uiPriority="64"/>
+    <w:lsdException w:name="Medium List 1 Accent 2" w:uiPriority="65"/>
+    <w:lsdException w:name="Medium List 2 Accent 2" w:uiPriority="66"/>
+    <w:lsdException w:name="Medium Grid 1 Accent 2" w:uiPriority="67"/>
+    <w:lsdException w:name="Medium Grid 2 Accent 2" w:uiPriority="68"/>
+    <w:lsdException w:name="Medium Grid 3 Accent 2" w:uiPriority="69"/>
+    <w:lsdException w:name="Dark List Accent 2" w:uiPriority="70"/>
+    <w:lsdException w:name="Colorful Shading Accent 2" w:uiPriority="71"/>
+    <w:lsdException w:name="Colorful List Accent 2" w:uiPriority="72"/>
+    <w:lsdException w:name="Colorful Grid Accent 2" w:uiPriority="73"/>
+    <w:lsdException w:name="Light Shading Accent 3" w:uiPriority="60"/>
+    <w:lsdException w:name="Light List Accent 3" w:uiPriority="61"/>
+    <w:lsdException w:name="Light Grid Accent 3" w:uiPriority="62"/>
+    <w:lsdException w:name="Medium Shading 1 Accent 3" w:uiPriority="63"/>
+    <w:lsdException w:name="Medium Shading 2 Accent 3" w:uiPriority="64"/>
+    <w:lsdException w:name="Medium List 1 Accent 3" w:uiPriority="65"/>
+    <w:lsdException w:name="Medium List 2 Accent 3" w:uiPriority="66"/>
+    <w:lsdException w:name="Medium Grid 1 Accent 3" w:uiPriority="67"/>
+    <w:lsdException w:name="Medium Grid 2 Accent 3" w:uiPriority="68"/>
+    <w:lsdException w:name="Medium Grid 3 Accent 3" w:uiPriority="69"/>
+    <w:lsdException w:name="Dark List Accent 3" w:uiPriority="70"/>
+    <w:lsdException w:name="Colorful Shading Accent 3" w:uiPriority="71"/>
+    <w:lsdException w:name="Colorful List Accent 3" w:uiPriority="72"/>
+    <w:lsdException w:name="Colorful Grid Accent 3" w:uiPriority="73"/>
+    <w:lsdException w:name="Light Shading Accent 4" w:uiPriority="60"/>
+    <w:lsdException w:name="Light List Accent 4" w:uiPriority="61"/>
+    <w:lsdException w:name="Light Grid Accent 4" w:uiPriority="62"/>
+    <w:lsdException w:name="Medium Shading 1 Accent 4" w:uiPriority="63"/>
+    <w:lsdException w:name="Medium Shading 2 Accent 4" w:uiPriority="64"/>
+    <w:lsdException w:name="Medium List 1 Accent 4" w:uiPriority="65"/>
+    <w:lsdException w:name="Medium List 2 Accent 4" w:uiPriority="66"/>
+    <w:lsdException w:name="Medium Grid 1 Accent 4" w:uiPriority="67"/>
+    <w:lsdException w:name="Medium Grid 2 Accent 4" w:uiPriority="68"/>
+    <w:lsdException w:name="Medium Grid 3 Accent 4" w:uiPriority="69"/>
+    <w:lsdException w:name="Dark List Accent 4" w:uiPriority="70"/>
+    <w:lsdException w:name="Colorful Shading Accent 4" w:uiPriority="71"/>
+    <w:lsdException w:name="Colorful List Accent 4" w:uiPriority="72"/>
+    <w:lsdException w:name="Colorful Grid Accent 4" w:uiPriority="73"/>
+    <w:lsdException w:name="Light Shading Accent 5" w:uiPriority="60"/>
+    <w:lsdException w:name="Light List Accent 5" w:uiPriority="61"/>
+    <w:lsdException w:name="Light Grid Accent 5" w:uiPriority="62"/>
+    <w:lsdException w:name="Medium Shading 1 Accent 5" w:uiPriority="63"/>
+    <w:lsdException w:name="Medium Shading 2 Accent 5" w:uiPriority="64"/>
+    <w:lsdException w:name="Medium List 1 Accent 5" w:uiPriority="65"/>
+    <w:lsdException w:name="Medium List 2 Accent 5" w:uiPriority="66"/>
+    <w:lsdException w:name="Medium Grid 1 Accent 5" w:uiPriority="67"/>
+    <w:lsdException w:name="Medium Grid 2 Accent 5" w:uiPriority="68"/>
+    <w:lsdException w:name="Medium Grid 3 Accent 5" w:uiPriority="69"/>
+    <w:lsdException w:name="Dark List Accent 5" w:uiPriority="70"/>
+    <w:lsdException w:name="Colorful Shading Accent 5" w:uiPriority="71"/>
+    <w:lsdException w:name="Colorful List Accent 5" w:uiPriority="72"/>
+    <w:lsdException w:name="Colorful Grid Accent 5" w:uiPriority="73"/>
+    <w:lsdException w:name="Light Shading Accent 6" w:uiPriority="60"/>
+    <w:lsdException w:name="Light List Accent 6" w:uiPriority="61"/>
+    <w:lsdException w:name="Light Grid Accent 6" w:uiPriority="62"/>
+    <w:lsdException w:name="Medium Shading 1 Accent 6" w:uiPriority="63"/>
+    <w:lsdException w:name="Medium Shading 2 Accent 6" w:uiPriority="64"/>
+    <w:lsdException w:name="Medium List 1 Accent 6" w:uiPriority="65"/>
+    <w:lsdException w:name="Medium List 2 Accent 6" w:uiPriority="66"/>
+    <w:lsdException w:name="Medium Grid 1 Accent 6" w:uiPriority="67"/>
+    <w:lsdException w:name="Medium Grid 2 Accent 6" w:uiPriority="68"/>
+    <w:lsdException w:name="Medium Grid 3 Accent 6" w:uiPriority="69"/>
+    <w:lsdException w:name="Dark List Accent 6" w:uiPriority="70"/>
+    <w:lsdException w:name="Colorful Shading Accent 6" w:uiPriority="71"/>
+    <w:lsdException w:name="Colorful List Accent 6" w:uiPriority="72"/>
+    <w:lsdException w:name="Colorful Grid Accent 6" w:uiPriority="73"/>
+    <w:lsdException w:name="Subtle Emphasis" w:uiPriority="19" w:qFormat="1"/>
+    <w:lsdException w:name="Intense Emphasis" w:uiPriority="21" w:qFormat="1"/>
+    <w:lsdException w:name="Subtle Reference" w:uiPriority="31" w:qFormat="1"/>
+    <w:lsdException w:name="Intense Reference" w:uiPriority="32" w:qFormat="1"/>
+    <w:lsdException w:name="Book Title" w:uiPriority="33" w:qFormat="1"/>
+    <w:lsdException w:name="Bibliography" w:semiHidden="1" w:uiPriority="37" w:unhideWhenUsed="1"/>
+    <w:lsdException w:name="TOC Heading" w:semiHidden="1" w:uiPriority="39" w:unhideWhenUsed="1" w:qFormat="1"/>
+    <w:lsdException w:name="Plain Table 1" w:uiPriority="41"/>
+    <w:lsdException w:name="Plain Table 2" w:uiPriority="42"/>
+    <w:lsdException w:name="Plain Table 3" w:uiPriority="43"/>
+    <w:lsdException w:name="Plain Table 4" w:uiPriority="44"/>
+    <w:lsdException w:name="Plain Table 5" w:uiPriority="45"/>
+    <w:lsdException w:name="Grid Table Light" w:uiPriority="40"/>
+    <w:lsdException w:name="Grid Table 1 Light" w:uiPriority="46"/>
+    <w:lsdException w:name="Grid Table 2" w:uiPriority="47"/>
+    <w:lsdException w:name="Grid Table 3" w:uiPriority="48"/>
+    <w:lsdException w:name="Grid Table 4" w:uiPriority="49"/>
+    <w:lsdException w:name="Grid Table 5 Dark" w:uiPriority="50"/>
+    <w:lsdException w:name="Grid Table 6 Colorful" w:uiPriority="51"/>
+    <w:lsdException w:name="Grid Table 7 Colorful" w:uiPriority="52"/>
+    <w:lsdException w:name="Grid Table 1 Light Accent 1" w:uiPriority="46"/>
+    <w:lsdException w:name="Grid Table 2 Accent 1" w:uiPriority="47"/>
+    <w:lsdException w:name="Grid Table 3 Accent 1" w:uiPriority="48"/>
+    <w:lsdException w:name="Grid Table 4 Accent 1" w:uiPriority="49"/>
+    <w:lsdException w:name="Grid Table 5 Dark Accent 1" w:uiPriority="50"/>
+    <w:lsdException w:name="Grid Table 6 Colorful Accent 1" w:uiPriority="51"/>
+    <w:lsdException w:name="Grid Table 7 Colorful Accent 1" w:uiPriority="52"/>
+    <w:lsdException w:name="Grid Table 1 Light Accent 2" w:uiPriority="46"/>
+    <w:lsdException w:name="Grid Table 2 Accent 2" w:uiPriority="47"/>
+    <w:lsdException w:name="Grid Table 3 Accent 2" w:uiPriority="48"/>
+    <w:lsdException w:name="Grid Table 4 Accent 2" w:uiPriority="49"/>
+    <w:lsdException w:name="Grid Table 5 Dark Accent 2" w:uiPriority="50"/>
+    <w:lsdException w:name="Grid Table 6 Colorful Accent 2" w:uiPriority="51"/>
+    <w:lsdException w:name="Grid Table 7 Colorful Accent 2" w:uiPriority="52"/>
+    <w:lsdException w:name="Grid Table 1 Light Accent 3" w:uiPriority="46"/>
+    <w:lsdException w:name="Grid Table 2 Accent 3" w:uiPriority="47"/>
+    <w:lsdException w:name="Grid Table 3 Accent 3" w:uiPriority="48"/>
+    <w:lsdException w:name="Grid Table 4 Accent 3" w:uiPriority="49"/>
+    <w:lsdException w:name="Grid Table 5 Dark Accent 3" w:uiPriority="50"/>
+    <w:lsdException w:name="Grid Table 6 Colorful Accent 3" w:uiPriority="51"/>
+    <w:lsdException w:name="Grid Table 7 Colorful Accent 3" w:uiPriority="52"/>
+    <w:lsdException w:name="Grid Table 1 Light Accent 4" w:uiPriority="46"/>
+    <w:lsdException w:name="Grid Table 2 Accent 4" w:uiPriority="47"/>
+    <w:lsdException w:name="Grid Table 3 Accent 4" w:uiPriority="48"/>
+    <w:lsdException w:name="Grid Table 4 Accent 4" w:uiPriority="49"/>
+    <w:lsdException w:name="Grid Table 5 Dark Accent 4" w:uiPriority="50"/>
+    <w:lsdException w:name="Grid Table 6 Colorful Accent 4" w:uiPriority="51"/>
+    <w:lsdException w:name="Grid Table 7 Colorful Accent 4" w:uiPriority="52"/>
+    <w:lsdException w:name="Grid Table 1 Light Accent 5" w:uiPriority="46"/>
+    <w:lsdException w:name="Grid Table 2 Accent 5" w:uiPriority="47"/>
+    <w:lsdException w:name="Grid Table 3 Accent 5" w:uiPriority="48"/>
+    <w:lsdException w:name="Grid Table 4 Accent 5" w:uiPriority="49"/>
+    <w:lsdException w:name="Grid Table 5 Dark Accent 5" w:uiPriority="50"/>
+    <w:lsdException w:name="Grid Table 6 Colorful Accent 5" w:uiPriority="51"/>
+    <w:lsdException w:name="Grid Table 7 Colorful Accent 5" w:uiPriority="52"/>
+    <w:lsdException w:name="Grid Table 1 Light Accent 6" w:uiPriority="46"/>
+    <w:lsdException w:name="Grid Table 2 Accent 6" w:uiPriority="47"/>
+    <w:lsdException w:name="Grid Table 3 Accent 6" w:uiPriority="48"/>
+    <w:lsdException w:name="Grid Table 4 Accent 6" w:uiPriority="49"/>
+    <w:lsdException w:name="Grid Table 5 Dark Accent 6" w:uiPriority="50"/>
+    <w:lsdException w:name="Grid Table 6 Colorful Accent 6" w:uiPriority="51"/>
+    <w:lsdException w:name="Grid Table 7 Colorful Accent 6" w:uiPriority="52"/>
+    <w:lsdException w:name="List Table 1 Light" w:uiPriority="46"/>
+    <w:lsdException w:name="List Table 2" w:uiPriority="47"/>
+    <w:lsdException w:name="List Table 3" w:uiPriority="48"/>
+    <w:lsdException w:name="List Table 4" w:uiPriority="49"/>
+    <w:lsdException w:name="List Table 5 Dark" w:uiPriority="50"/>
+    <w:lsdException w:name="List Table 6 Colorful" w:uiPriority="51"/>
+    <w:lsdException w:name="List Table 7 Colorful" w:uiPriority="52"/>
+    <w:lsdException w:name="List Table 1 Light Accent 1" w:uiPriority="46"/>
+    <w:lsdException w:name="List Table 2 Accent 1" w:uiPriority="47"/>
+    <w:lsdException w:name="List Table 3 Accent 1" w:uiPriority="48"/>
+    <w:lsdException w:name="List Table 4 Accent 1" w:uiPriority="49"/>
+    <w:lsdException w:name="List Table 5 Dark Accent 1" w:uiPriority="50"/>
+    <w:lsdException w:name="List Table 6 Colorful Accent 1" w:uiPriority="51"/>
+    <w:lsdException w:name="List Table 7 Colorful Accent 1" w:uiPriority="52"/>
+    <w:lsdException w:name="List Table 1 Light Accent 2" w:uiPriority="46"/>
+    <w:lsdException w:name="List Table 2 Accent 2" w:uiPriority="47"/>
+    <w:lsdException w:name="List Table 3 Accent 2" w:uiPriority="48"/>
+    <w:lsdException w:name="List Table 4 Accent 2" w:uiPriority="49"/>
+    <w:lsdException w:name="List Table 5 Dark Accent 2" w:uiPriority="50"/>
+    <w:lsdException w:name="List Table 6 Colorful Accent 2" w:uiPriority="51"/>
+    <w:lsdException w:name="List Table 7 Colorful Accent 2" w:uiPriority="52"/>
+    <w:lsdException w:name="List Table 1 Light Accent 3" w:uiPriority="46"/>
+    <w:lsdException w:name="List Table 2 Accent 3" w:uiPriority="47"/>
+    <w:lsdException w:name="List Table 3 Accent 3" w:uiPriority="48"/>
+    <w:lsdException w:name="List Table 4 Accent 3" w:uiPriority="49"/>
+    <w:lsdException w:name="List Table 5 Dark Accent 3" w:uiPriority="50"/>
+    <w:lsdException w:name="List Table 6 Colorful Accent 3" w:uiPriority="51"/>
+    <w:lsdException w:name="List Table 7 Colorful Accent 3" w:uiPriority="52"/>
+    <w:lsdException w:name="List Table 1 Light Accent 4" w:uiPriority="46"/>
+    <w:lsdException w:name="List Table 2 Accent 4" w:uiPriority="47"/>
+    <w:lsdException w:name="List Table 3 Accent 4" w:uiPriority="48"/>
+    <w:lsdException w:name="List Table 4 Accent 4" w:uiPriority="49"/>
+    <w:lsdException w:name="List Table 5 Dark Accent 4" w:uiPriority="50"/>
+    <w:lsdException w:name="List Table 6 Colorful Accent 4" w:uiPriority="51"/>
+    <w:lsdException w:name="List Table 7 Colorful Accent 4" w:uiPriority="52"/>
+    <w:lsdException w:name="List Table 1 Light Accent 5" w:uiPriority="46"/>
+    <w:lsdException w:name="List Table 2 Accent 5" w:uiPriority="47"/>
+    <w:lsdException w:name="List Table 3 Accent 5" w:uiPriority="48"/>
+    <w:lsdException w:name="List Table 4 Accent 5" w:uiPriority="49"/>
+    <w:lsdException w:name="List Table 5 Dark Accent 5" w:uiPriority="50"/>
+    <w:lsdException w:name="List Table 6 Colorful Accent 5" w:uiPriority="51"/>
+    <w:lsdException w:name="List Table 7 Colorful Accent 5" w:uiPriority="52"/>
+    <w:lsdException w:name="List Table 1 Light Accent 6" w:uiPriority="46"/>
+    <w:lsdException w:name="List Table 2 Accent 6" w:uiPriority="47"/>
+    <w:lsdException w:name="List Table 3 Accent 6" w:uiPriority="48"/>
+    <w:lsdException w:name="List Table 4 Accent 6" w:uiPriority="49"/>
+    <w:lsdException w:name="List Table 5 Dark Accent 6" w:uiPriority="50"/>
+    <w:lsdException w:name="List Table 6 Colorful Accent 6" w:uiPriority="51"/>
+    <w:lsdException w:name="List Table 7 Colorful Accent 6" w:uiPriority="52"/>
+    <w:lsdException w:name="Mention" w:semiHidden="1" w:unhideWhenUsed="1"/>
+    <w:lsdException w:name="Smart Hyperlink" w:semiHidden="1" w:unhideWhenUsed="1"/>
+    <w:lsdException w:name="Hashtag" w:semiHidden="1" w:unhideWhenUsed="1"/>
+    <w:lsdException w:name="Unresolved Mention" w:semiHidden="1" w:unhideWhenUsed="1"/>
+    <w:lsdException w:name="Smart Link" w:semiHidden="1" w:unhideWhenUsed="1"/>
   </w:latentStyles>
   <w:style w:type="paragraph" w:default="1" w:styleId="Normal">
     <w:name w:val="Normal"/>
@@ -1886,7 +2876,6 @@
       <w:spacing w:after="0" w:line="240" w:lineRule="auto"/>
     </w:pPr>
     <w:tblPr>
-      <w:tblInd w:w="0" w:type="dxa"/>
       <w:tblBorders>
         <w:top w:val="single" w:sz="4" w:space="0" w:color="auto"/>
         <w:left w:val="single" w:sz="4" w:space="0" w:color="auto"/>
@@ -1895,276 +2884,6 @@
         <w:insideH w:val="single" w:sz="4" w:space="0" w:color="auto"/>
         <w:insideV w:val="single" w:sz="4" w:space="0" w:color="auto"/>
       </w:tblBorders>
-      <w:tblCellMar>
-        <w:top w:w="0" w:type="dxa"/>
-        <w:left w:w="108" w:type="dxa"/>
-        <w:bottom w:w="0" w:type="dxa"/>
-        <w:right w:w="108" w:type="dxa"/>
-      </w:tblCellMar>
-    </w:tblPr>
-  </w:style>
-</w:styles>
-</file>
-
-<file path=word/stylesWithEffects.xml><?xml version="1.0" encoding="utf-8"?>
-<w:styles xmlns:wpc="http://schemas.microsoft.com/office/word/2010/wordprocessingCanvas" xmlns:mc="http://schemas.openxmlformats.org/markup-compatibility/2006" xmlns:o="urn:schemas-microsoft-com:office:office" xmlns:r="http://schemas.openxmlformats.org/officeDocument/2006/relationships" xmlns:m="http://schemas.openxmlformats.org/officeDocument/2006/math" xmlns:v="urn:schemas-microsoft-com:vml" xmlns:wp14="http://schemas.microsoft.com/office/word/2010/wordprocessingDrawing" xmlns:wp="http://schemas.openxmlformats.org/drawingml/2006/wordprocessingDrawing" xmlns:w10="urn:schemas-microsoft-com:office:word" xmlns:w="http://schemas.openxmlformats.org/wordprocessingml/2006/main" xmlns:w14="http://schemas.microsoft.com/office/word/2010/wordml" xmlns:wpg="http://schemas.microsoft.com/office/word/2010/wordprocessingGroup" xmlns:wpi="http://schemas.microsoft.com/office/word/2010/wordprocessingInk" xmlns:wne="http://schemas.microsoft.com/office/word/2006/wordml" xmlns:wps="http://schemas.microsoft.com/office/word/2010/wordprocessingShape" mc:Ignorable="w14 wp14">
-  <w:docDefaults>
-    <w:rPrDefault>
-      <w:rPr>
-        <w:rFonts w:asciiTheme="minorHAnsi" w:eastAsiaTheme="minorEastAsia" w:hAnsiTheme="minorHAnsi" w:cstheme="minorBidi"/>
-        <w:sz w:val="22"/>
-        <w:szCs w:val="22"/>
-        <w:lang w:val="en-US" w:eastAsia="en-US" w:bidi="ar-SA"/>
-      </w:rPr>
-    </w:rPrDefault>
-    <w:pPrDefault>
-      <w:pPr>
-        <w:spacing w:after="200" w:line="276" w:lineRule="auto"/>
-      </w:pPr>
-    </w:pPrDefault>
-  </w:docDefaults>
-  <w:latentStyles w:defLockedState="0" w:defUIPriority="99" w:defSemiHidden="1" w:defUnhideWhenUsed="1" w:defQFormat="0" w:count="267">
-    <w:lsdException w:name="Normal" w:semiHidden="0" w:uiPriority="0" w:unhideWhenUsed="0" w:qFormat="1"/>
-    <w:lsdException w:name="heading 1" w:semiHidden="0" w:uiPriority="9" w:unhideWhenUsed="0" w:qFormat="1"/>
-    <w:lsdException w:name="heading 2" w:uiPriority="9" w:qFormat="1"/>
-    <w:lsdException w:name="heading 3" w:uiPriority="9" w:qFormat="1"/>
-    <w:lsdException w:name="heading 4" w:uiPriority="9" w:qFormat="1"/>
-    <w:lsdException w:name="heading 5" w:uiPriority="9" w:qFormat="1"/>
-    <w:lsdException w:name="heading 6" w:uiPriority="9" w:qFormat="1"/>
-    <w:lsdException w:name="heading 7" w:uiPriority="9" w:qFormat="1"/>
-    <w:lsdException w:name="heading 8" w:uiPriority="9" w:qFormat="1"/>
-    <w:lsdException w:name="heading 9" w:uiPriority="9" w:qFormat="1"/>
-    <w:lsdException w:name="toc 1" w:uiPriority="39"/>
-    <w:lsdException w:name="toc 2" w:uiPriority="39"/>
-    <w:lsdException w:name="toc 3" w:uiPriority="39"/>
-    <w:lsdException w:name="toc 4" w:uiPriority="39"/>
-    <w:lsdException w:name="toc 5" w:uiPriority="39"/>
-    <w:lsdException w:name="toc 6" w:uiPriority="39"/>
-    <w:lsdException w:name="toc 7" w:uiPriority="39"/>
-    <w:lsdException w:name="toc 8" w:uiPriority="39"/>
-    <w:lsdException w:name="toc 9" w:uiPriority="39"/>
-    <w:lsdException w:name="caption" w:uiPriority="35" w:qFormat="1"/>
-    <w:lsdException w:name="Title" w:semiHidden="0" w:uiPriority="10" w:unhideWhenUsed="0" w:qFormat="1"/>
-    <w:lsdException w:name="Default Paragraph Font" w:uiPriority="1"/>
-    <w:lsdException w:name="Subtitle" w:semiHidden="0" w:uiPriority="11" w:unhideWhenUsed="0" w:qFormat="1"/>
-    <w:lsdException w:name="Strong" w:semiHidden="0" w:uiPriority="22" w:unhideWhenUsed="0" w:qFormat="1"/>
-    <w:lsdException w:name="Emphasis" w:semiHidden="0" w:uiPriority="20" w:unhideWhenUsed="0" w:qFormat="1"/>
-    <w:lsdException w:name="Table Grid" w:semiHidden="0" w:uiPriority="59" w:unhideWhenUsed="0"/>
-    <w:lsdException w:name="Placeholder Text" w:unhideWhenUsed="0"/>
-    <w:lsdException w:name="No Spacing" w:semiHidden="0" w:uiPriority="1" w:unhideWhenUsed="0" w:qFormat="1"/>
-    <w:lsdException w:name="Light Shading" w:semiHidden="0" w:uiPriority="60" w:unhideWhenUsed="0"/>
-    <w:lsdException w:name="Light List" w:semiHidden="0" w:uiPriority="61" w:unhideWhenUsed="0"/>
-    <w:lsdException w:name="Light Grid" w:semiHidden="0" w:uiPriority="62" w:unhideWhenUsed="0"/>
-    <w:lsdException w:name="Medium Shading 1" w:semiHidden="0" w:uiPriority="63" w:unhideWhenUsed="0"/>
-    <w:lsdException w:name="Medium Shading 2" w:semiHidden="0" w:uiPriority="64" w:unhideWhenUsed="0"/>
-    <w:lsdException w:name="Medium List 1" w:semiHidden="0" w:uiPriority="65" w:unhideWhenUsed="0"/>
-    <w:lsdException w:name="Medium List 2" w:semiHidden="0" w:uiPriority="66" w:unhideWhenUsed="0"/>
-    <w:lsdException w:name="Medium Grid 1" w:semiHidden="0" w:uiPriority="67" w:unhideWhenUsed="0"/>
-    <w:lsdException w:name="Medium Grid 2" w:semiHidden="0" w:uiPriority="68" w:unhideWhenUsed="0"/>
-    <w:lsdException w:name="Medium Grid 3" w:semiHidden="0" w:uiPriority="69" w:unhideWhenUsed="0"/>
-    <w:lsdException w:name="Dark List" w:semiHidden="0" w:uiPriority="70" w:unhideWhenUsed="0"/>
-    <w:lsdException w:name="Colorful Shading" w:semiHidden="0" w:uiPriority="71" w:unhideWhenUsed="0"/>
-    <w:lsdException w:name="Colorful List" w:semiHidden="0" w:uiPriority="72" w:unhideWhenUsed="0"/>
-    <w:lsdException w:name="Colorful Grid" w:semiHidden="0" w:uiPriority="73" w:unhideWhenUsed="0"/>
-    <w:lsdException w:name="Light Shading Accent 1" w:semiHidden="0" w:uiPriority="60" w:unhideWhenUsed="0"/>
-    <w:lsdException w:name="Light List Accent 1" w:semiHidden="0" w:uiPriority="61" w:unhideWhenUsed="0"/>
-    <w:lsdException w:name="Light Grid Accent 1" w:semiHidden="0" w:uiPriority="62" w:unhideWhenUsed="0"/>
-    <w:lsdException w:name="Medium Shading 1 Accent 1" w:semiHidden="0" w:uiPriority="63" w:unhideWhenUsed="0"/>
-    <w:lsdException w:name="Medium Shading 2 Accent 1" w:semiHidden="0" w:uiPriority="64" w:unhideWhenUsed="0"/>
-    <w:lsdException w:name="Medium List 1 Accent 1" w:semiHidden="0" w:uiPriority="65" w:unhideWhenUsed="0"/>
-    <w:lsdException w:name="Revision" w:unhideWhenUsed="0"/>
-    <w:lsdException w:name="List Paragraph" w:semiHidden="0" w:uiPriority="34" w:unhideWhenUsed="0" w:qFormat="1"/>
-    <w:lsdException w:name="Quote" w:semiHidden="0" w:uiPriority="29" w:unhideWhenUsed="0" w:qFormat="1"/>
-    <w:lsdException w:name="Intense Quote" w:semiHidden="0" w:uiPriority="30" w:unhideWhenUsed="0" w:qFormat="1"/>
-    <w:lsdException w:name="Medium List 2 Accent 1" w:semiHidden="0" w:uiPriority="66" w:unhideWhenUsed="0"/>
-    <w:lsdException w:name="Medium Grid 1 Accent 1" w:semiHidden="0" w:uiPriority="67" w:unhideWhenUsed="0"/>
-    <w:lsdException w:name="Medium Grid 2 Accent 1" w:semiHidden="0" w:uiPriority="68" w:unhideWhenUsed="0"/>
-    <w:lsdException w:name="Medium Grid 3 Accent 1" w:semiHidden="0" w:uiPriority="69" w:unhideWhenUsed="0"/>
-    <w:lsdException w:name="Dark List Accent 1" w:semiHidden="0" w:uiPriority="70" w:unhideWhenUsed="0"/>
-    <w:lsdException w:name="Colorful Shading Accent 1" w:semiHidden="0" w:uiPriority="71" w:unhideWhenUsed="0"/>
-    <w:lsdException w:name="Colorful List Accent 1" w:semiHidden="0" w:uiPriority="72" w:unhideWhenUsed="0"/>
-    <w:lsdException w:name="Colorful Grid Accent 1" w:semiHidden="0" w:uiPriority="73" w:unhideWhenUsed="0"/>
-    <w:lsdException w:name="Light Shading Accent 2" w:semiHidden="0" w:uiPriority="60" w:unhideWhenUsed="0"/>
-    <w:lsdException w:name="Light List Accent 2" w:semiHidden="0" w:uiPriority="61" w:unhideWhenUsed="0"/>
-    <w:lsdException w:name="Light Grid Accent 2" w:semiHidden="0" w:uiPriority="62" w:unhideWhenUsed="0"/>
-    <w:lsdException w:name="Medium Shading 1 Accent 2" w:semiHidden="0" w:uiPriority="63" w:unhideWhenUsed="0"/>
-    <w:lsdException w:name="Medium Shading 2 Accent 2" w:semiHidden="0" w:uiPriority="64" w:unhideWhenUsed="0"/>
-    <w:lsdException w:name="Medium List 1 Accent 2" w:semiHidden="0" w:uiPriority="65" w:unhideWhenUsed="0"/>
-    <w:lsdException w:name="Medium List 2 Accent 2" w:semiHidden="0" w:uiPriority="66" w:unhideWhenUsed="0"/>
-    <w:lsdException w:name="Medium Grid 1 Accent 2" w:semiHidden="0" w:uiPriority="67" w:unhideWhenUsed="0"/>
-    <w:lsdException w:name="Medium Grid 2 Accent 2" w:semiHidden="0" w:uiPriority="68" w:unhideWhenUsed="0"/>
-    <w:lsdException w:name="Medium Grid 3 Accent 2" w:semiHidden="0" w:uiPriority="69" w:unhideWhenUsed="0"/>
-    <w:lsdException w:name="Dark List Accent 2" w:semiHidden="0" w:uiPriority="70" w:unhideWhenUsed="0"/>
-    <w:lsdException w:name="Colorful Shading Accent 2" w:semiHidden="0" w:uiPriority="71" w:unhideWhenUsed="0"/>
-    <w:lsdException w:name="Colorful List Accent 2" w:semiHidden="0" w:uiPriority="72" w:unhideWhenUsed="0"/>
-    <w:lsdException w:name="Colorful Grid Accent 2" w:semiHidden="0" w:uiPriority="73" w:unhideWhenUsed="0"/>
-    <w:lsdException w:name="Light Shading Accent 3" w:semiHidden="0" w:uiPriority="60" w:unhideWhenUsed="0"/>
-    <w:lsdException w:name="Light List Accent 3" w:semiHidden="0" w:uiPriority="61" w:unhideWhenUsed="0"/>
-    <w:lsdException w:name="Light Grid Accent 3" w:semiHidden="0" w:uiPriority="62" w:unhideWhenUsed="0"/>
-    <w:lsdException w:name="Medium Shading 1 Accent 3" w:semiHidden="0" w:uiPriority="63" w:unhideWhenUsed="0"/>
-    <w:lsdException w:name="Medium Shading 2 Accent 3" w:semiHidden="0" w:uiPriority="64" w:unhideWhenUsed="0"/>
-    <w:lsdException w:name="Medium List 1 Accent 3" w:semiHidden="0" w:uiPriority="65" w:unhideWhenUsed="0"/>
-    <w:lsdException w:name="Medium List 2 Accent 3" w:semiHidden="0" w:uiPriority="66" w:unhideWhenUsed="0"/>
-    <w:lsdException w:name="Medium Grid 1 Accent 3" w:semiHidden="0" w:uiPriority="67" w:unhideWhenUsed="0"/>
-    <w:lsdException w:name="Medium Grid 2 Accent 3" w:semiHidden="0" w:uiPriority="68" w:unhideWhenUsed="0"/>
-    <w:lsdException w:name="Medium Grid 3 Accent 3" w:semiHidden="0" w:uiPriority="69" w:unhideWhenUsed="0"/>
-    <w:lsdException w:name="Dark List Accent 3" w:semiHidden="0" w:uiPriority="70" w:unhideWhenUsed="0"/>
-    <w:lsdException w:name="Colorful Shading Accent 3" w:semiHidden="0" w:uiPriority="71" w:unhideWhenUsed="0"/>
-    <w:lsdException w:name="Colorful List Accent 3" w:semiHidden="0" w:uiPriority="72" w:unhideWhenUsed="0"/>
-    <w:lsdException w:name="Colorful Grid Accent 3" w:semiHidden="0" w:uiPriority="73" w:unhideWhenUsed="0"/>
-    <w:lsdException w:name="Light Shading Accent 4" w:semiHidden="0" w:uiPriority="60" w:unhideWhenUsed="0"/>
-    <w:lsdException w:name="Light List Accent 4" w:semiHidden="0" w:uiPriority="61" w:unhideWhenUsed="0"/>
-    <w:lsdException w:name="Light Grid Accent 4" w:semiHidden="0" w:uiPriority="62" w:unhideWhenUsed="0"/>
-    <w:lsdException w:name="Medium Shading 1 Accent 4" w:semiHidden="0" w:uiPriority="63" w:unhideWhenUsed="0"/>
-    <w:lsdException w:name="Medium Shading 2 Accent 4" w:semiHidden="0" w:uiPriority="64" w:unhideWhenUsed="0"/>
-    <w:lsdException w:name="Medium List 1 Accent 4" w:semiHidden="0" w:uiPriority="65" w:unhideWhenUsed="0"/>
-    <w:lsdException w:name="Medium List 2 Accent 4" w:semiHidden="0" w:uiPriority="66" w:unhideWhenUsed="0"/>
-    <w:lsdException w:name="Medium Grid 1 Accent 4" w:semiHidden="0" w:uiPriority="67" w:unhideWhenUsed="0"/>
-    <w:lsdException w:name="Medium Grid 2 Accent 4" w:semiHidden="0" w:uiPriority="68" w:unhideWhenUsed="0"/>
-    <w:lsdException w:name="Medium Grid 3 Accent 4" w:semiHidden="0" w:uiPriority="69" w:unhideWhenUsed="0"/>
-    <w:lsdException w:name="Dark List Accent 4" w:semiHidden="0" w:uiPriority="70" w:unhideWhenUsed="0"/>
-    <w:lsdException w:name="Colorful Shading Accent 4" w:semiHidden="0" w:uiPriority="71" w:unhideWhenUsed="0"/>
-    <w:lsdException w:name="Colorful List Accent 4" w:semiHidden="0" w:uiPriority="72" w:unhideWhenUsed="0"/>
-    <w:lsdException w:name="Colorful Grid Accent 4" w:semiHidden="0" w:uiPriority="73" w:unhideWhenUsed="0"/>
-    <w:lsdException w:name="Light Shading Accent 5" w:semiHidden="0" w:uiPriority="60" w:unhideWhenUsed="0"/>
-    <w:lsdException w:name="Light List Accent 5" w:semiHidden="0" w:uiPriority="61" w:unhideWhenUsed="0"/>
-    <w:lsdException w:name="Light Grid Accent 5" w:semiHidden="0" w:uiPriority="62" w:unhideWhenUsed="0"/>
-    <w:lsdException w:name="Medium Shading 1 Accent 5" w:semiHidden="0" w:uiPriority="63" w:unhideWhenUsed="0"/>
-    <w:lsdException w:name="Medium Shading 2 Accent 5" w:semiHidden="0" w:uiPriority="64" w:unhideWhenUsed="0"/>
-    <w:lsdException w:name="Medium List 1 Accent 5" w:semiHidden="0" w:uiPriority="65" w:unhideWhenUsed="0"/>
-    <w:lsdException w:name="Medium List 2 Accent 5" w:semiHidden="0" w:uiPriority="66" w:unhideWhenUsed="0"/>
-    <w:lsdException w:name="Medium Grid 1 Accent 5" w:semiHidden="0" w:uiPriority="67" w:unhideWhenUsed="0"/>
-    <w:lsdException w:name="Medium Grid 2 Accent 5" w:semiHidden="0" w:uiPriority="68" w:unhideWhenUsed="0"/>
-    <w:lsdException w:name="Medium Grid 3 Accent 5" w:semiHidden="0" w:uiPriority="69" w:unhideWhenUsed="0"/>
-    <w:lsdException w:name="Dark List Accent 5" w:semiHidden="0" w:uiPriority="70" w:unhideWhenUsed="0"/>
-    <w:lsdException w:name="Colorful Shading Accent 5" w:semiHidden="0" w:uiPriority="71" w:unhideWhenUsed="0"/>
-    <w:lsdException w:name="Colorful List Accent 5" w:semiHidden="0" w:uiPriority="72" w:unhideWhenUsed="0"/>
-    <w:lsdException w:name="Colorful Grid Accent 5" w:semiHidden="0" w:uiPriority="73" w:unhideWhenUsed="0"/>
-    <w:lsdException w:name="Light Shading Accent 6" w:semiHidden="0" w:uiPriority="60" w:unhideWhenUsed="0"/>
-    <w:lsdException w:name="Light List Accent 6" w:semiHidden="0" w:uiPriority="61" w:unhideWhenUsed="0"/>
-    <w:lsdException w:name="Light Grid Accent 6" w:semiHidden="0" w:uiPriority="62" w:unhideWhenUsed="0"/>
-    <w:lsdException w:name="Medium Shading 1 Accent 6" w:semiHidden="0" w:uiPriority="63" w:unhideWhenUsed="0"/>
-    <w:lsdException w:name="Medium Shading 2 Accent 6" w:semiHidden="0" w:uiPriority="64" w:unhideWhenUsed="0"/>
-    <w:lsdException w:name="Medium List 1 Accent 6" w:semiHidden="0" w:uiPriority="65" w:unhideWhenUsed="0"/>
-    <w:lsdException w:name="Medium List 2 Accent 6" w:semiHidden="0" w:uiPriority="66" w:unhideWhenUsed="0"/>
-    <w:lsdException w:name="Medium Grid 1 Accent 6" w:semiHidden="0" w:uiPriority="67" w:unhideWhenUsed="0"/>
-    <w:lsdException w:name="Medium Grid 2 Accent 6" w:semiHidden="0" w:uiPriority="68" w:unhideWhenUsed="0"/>
-    <w:lsdException w:name="Medium Grid 3 Accent 6" w:semiHidden="0" w:uiPriority="69" w:unhideWhenUsed="0"/>
-    <w:lsdException w:name="Dark List Accent 6" w:semiHidden="0" w:uiPriority="70" w:unhideWhenUsed="0"/>
-    <w:lsdException w:name="Colorful Shading Accent 6" w:semiHidden="0" w:uiPriority="71" w:unhideWhenUsed="0"/>
-    <w:lsdException w:name="Colorful List Accent 6" w:semiHidden="0" w:uiPriority="72" w:unhideWhenUsed="0"/>
-    <w:lsdException w:name="Colorful Grid Accent 6" w:semiHidden="0" w:uiPriority="73" w:unhideWhenUsed="0"/>
-    <w:lsdException w:name="Subtle Emphasis" w:semiHidden="0" w:uiPriority="19" w:unhideWhenUsed="0" w:qFormat="1"/>
-    <w:lsdException w:name="Intense Emphasis" w:semiHidden="0" w:uiPriority="21" w:unhideWhenUsed="0" w:qFormat="1"/>
-    <w:lsdException w:name="Subtle Reference" w:semiHidden="0" w:uiPriority="31" w:unhideWhenUsed="0" w:qFormat="1"/>
-    <w:lsdException w:name="Intense Reference" w:semiHidden="0" w:uiPriority="32" w:unhideWhenUsed="0" w:qFormat="1"/>
-    <w:lsdException w:name="Book Title" w:semiHidden="0" w:uiPriority="33" w:unhideWhenUsed="0" w:qFormat="1"/>
-    <w:lsdException w:name="Bibliography" w:uiPriority="37"/>
-    <w:lsdException w:name="TOC Heading" w:uiPriority="39" w:qFormat="1"/>
-  </w:latentStyles>
-  <w:style w:type="paragraph" w:default="1" w:styleId="Normal">
-    <w:name w:val="Normal"/>
-    <w:qFormat/>
-  </w:style>
-  <w:style w:type="character" w:default="1" w:styleId="DefaultParagraphFont">
-    <w:name w:val="Default Paragraph Font"/>
-    <w:uiPriority w:val="1"/>
-    <w:semiHidden/>
-    <w:unhideWhenUsed/>
-  </w:style>
-  <w:style w:type="table" w:default="1" w:styleId="TableNormal">
-    <w:name w:val="Normal Table"/>
-    <w:uiPriority w:val="99"/>
-    <w:semiHidden/>
-    <w:unhideWhenUsed/>
-    <w:tblPr>
-      <w:tblInd w:w="0" w:type="dxa"/>
-      <w:tblCellMar>
-        <w:top w:w="0" w:type="dxa"/>
-        <w:left w:w="108" w:type="dxa"/>
-        <w:bottom w:w="0" w:type="dxa"/>
-        <w:right w:w="108" w:type="dxa"/>
-      </w:tblCellMar>
-    </w:tblPr>
-  </w:style>
-  <w:style w:type="numbering" w:default="1" w:styleId="NoList">
-    <w:name w:val="No List"/>
-    <w:uiPriority w:val="99"/>
-    <w:semiHidden/>
-    <w:unhideWhenUsed/>
-  </w:style>
-  <w:style w:type="paragraph" w:styleId="Header">
-    <w:name w:val="header"/>
-    <w:basedOn w:val="Normal"/>
-    <w:link w:val="HeaderChar"/>
-    <w:uiPriority w:val="99"/>
-    <w:semiHidden/>
-    <w:unhideWhenUsed/>
-    <w:rsid w:val="008535F6"/>
-    <w:pPr>
-      <w:tabs>
-        <w:tab w:val="center" w:pos="4680"/>
-        <w:tab w:val="right" w:pos="9360"/>
-      </w:tabs>
-      <w:spacing w:after="0" w:line="240" w:lineRule="auto"/>
-    </w:pPr>
-  </w:style>
-  <w:style w:type="character" w:customStyle="1" w:styleId="HeaderChar">
-    <w:name w:val="Header Char"/>
-    <w:basedOn w:val="DefaultParagraphFont"/>
-    <w:link w:val="Header"/>
-    <w:uiPriority w:val="99"/>
-    <w:semiHidden/>
-    <w:rsid w:val="008535F6"/>
-  </w:style>
-  <w:style w:type="paragraph" w:styleId="Footer">
-    <w:name w:val="footer"/>
-    <w:basedOn w:val="Normal"/>
-    <w:link w:val="FooterChar"/>
-    <w:uiPriority w:val="99"/>
-    <w:semiHidden/>
-    <w:unhideWhenUsed/>
-    <w:rsid w:val="008535F6"/>
-    <w:pPr>
-      <w:tabs>
-        <w:tab w:val="center" w:pos="4680"/>
-        <w:tab w:val="right" w:pos="9360"/>
-      </w:tabs>
-      <w:spacing w:after="0" w:line="240" w:lineRule="auto"/>
-    </w:pPr>
-  </w:style>
-  <w:style w:type="character" w:customStyle="1" w:styleId="FooterChar">
-    <w:name w:val="Footer Char"/>
-    <w:basedOn w:val="DefaultParagraphFont"/>
-    <w:link w:val="Footer"/>
-    <w:uiPriority w:val="99"/>
-    <w:semiHidden/>
-    <w:rsid w:val="008535F6"/>
-  </w:style>
-  <w:style w:type="table" w:styleId="TableGrid">
-    <w:name w:val="Table Grid"/>
-    <w:basedOn w:val="TableNormal"/>
-    <w:uiPriority w:val="59"/>
-    <w:rsid w:val="001F0A8E"/>
-    <w:pPr>
-      <w:spacing w:after="0" w:line="240" w:lineRule="auto"/>
-    </w:pPr>
-    <w:tblPr>
-      <w:tblInd w:w="0" w:type="dxa"/>
-      <w:tblBorders>
-        <w:top w:val="single" w:sz="4" w:space="0" w:color="auto"/>
-        <w:left w:val="single" w:sz="4" w:space="0" w:color="auto"/>
-        <w:bottom w:val="single" w:sz="4" w:space="0" w:color="auto"/>
-        <w:right w:val="single" w:sz="4" w:space="0" w:color="auto"/>
-        <w:insideH w:val="single" w:sz="4" w:space="0" w:color="auto"/>
-        <w:insideV w:val="single" w:sz="4" w:space="0" w:color="auto"/>
-      </w:tblBorders>
-      <w:tblCellMar>
-        <w:top w:w="0" w:type="dxa"/>
-        <w:left w:w="108" w:type="dxa"/>
-        <w:bottom w:w="0" w:type="dxa"/>
-        <w:right w:w="108" w:type="dxa"/>
-      </w:tblCellMar>
     </w:tblPr>
   </w:style>
 </w:styles>

</xml_diff>

<commit_message>
feat(core): automate document generation, resolve invoice duplication, and implement deposit management
</commit_message>
<xml_diff>
--- a/rusun-backend/app/templates/template_ba_wawancara.docx
+++ b/rusun-backend/app/templates/template_ba_wawancara.docx
@@ -41,7 +41,7 @@
           <v:shape id="_x0000_s1027" type="#_x0000_t75" style="position:absolute;margin-left:-24.75pt;margin-top:1.85pt;width:64.6pt;height:71.1pt;z-index:251661312;visibility:visible;mso-wrap-style:tight;mso-wrap-edited:f">
             <v:imagedata r:id="rId6" o:title=""/>
           </v:shape>
-          <o:OLEObject Type="Embed" ProgID="Word.Picture.8" ShapeID="_x0000_s1027" DrawAspect="Content" ObjectID="_1837432680" r:id="rId7"/>
+          <o:OLEObject Type="Embed" ProgID="Word.Picture.8" ShapeID="_x0000_s1027" DrawAspect="Content" ObjectID="_1837444644" r:id="rId7"/>
         </w:object>
       </w:r>
       <w:r>
@@ -389,7 +389,7 @@
           </mc:Choice>
           <mc:Fallback>
             <w:pict>
-              <v:line w14:anchorId="548B9BEE" id="Line 2" o:spid="_x0000_s1026" style="position:absolute;flip:y;z-index:251660288;visibility:visible;mso-wrap-style:square;mso-width-percent:0;mso-height-percent:0;mso-wrap-distance-left:9pt;mso-wrap-distance-top:0;mso-wrap-distance-right:9pt;mso-wrap-distance-bottom:0;mso-position-horizontal:absolute;mso-position-horizontal-relative:text;mso-position-vertical:absolute;mso-position-vertical-relative:text;mso-width-percent:0;mso-height-percent:0;mso-width-relative:page;mso-height-relative:page" from="-30.4pt,9.65pt" to="502.4pt,9.65pt" o:gfxdata="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" strokeweight="4.5pt">
+              <v:line w14:anchorId="26E86879" id="Line 2" o:spid="_x0000_s1026" style="position:absolute;flip:y;z-index:251660288;visibility:visible;mso-wrap-style:square;mso-width-percent:0;mso-height-percent:0;mso-wrap-distance-left:9pt;mso-wrap-distance-top:0;mso-wrap-distance-right:9pt;mso-wrap-distance-bottom:0;mso-position-horizontal:absolute;mso-position-horizontal-relative:text;mso-position-vertical:absolute;mso-position-vertical-relative:text;mso-width-percent:0;mso-height-percent:0;mso-width-relative:page;mso-height-relative:page" from="-30.4pt,9.65pt" to="502.4pt,9.65pt" o:gfxdata="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" strokeweight="4.5pt">
                 <v:stroke linestyle="thickThin"/>
               </v:line>
             </w:pict>
@@ -432,25 +432,13 @@
     <w:p>
       <w:pPr>
         <w:ind w:left="-142"/>
+        <w:jc w:val="center"/>
         <w:rPr>
           <w:rFonts w:ascii="Bookman Old Style" w:hAnsi="Bookman Old Style"/>
           <w:b/>
         </w:rPr>
       </w:pPr>
-      <w:r>
-        <w:rPr>
-          <w:rFonts w:ascii="Bookman Old Style" w:hAnsi="Bookman Old Style"/>
-          <w:b/>
-        </w:rPr>
-        <w:t xml:space="preserve">               </w:t>
-      </w:r>
-      <w:r>
-        <w:rPr>
-          <w:rFonts w:ascii="Bookman Old Style" w:hAnsi="Bookman Old Style"/>
-          <w:b/>
-        </w:rPr>
-        <w:t xml:space="preserve">                </w:t>
-      </w:r>
+      <w:proofErr w:type="gramStart"/>
       <w:r>
         <w:rPr>
           <w:rFonts w:ascii="Bookman Old Style" w:hAnsi="Bookman Old Style"/>
@@ -464,7 +452,16 @@
           <w:b/>
           <w:lang w:val="id-ID"/>
         </w:rPr>
-        <w:t xml:space="preserve"> : </w:t>
+        <w:t xml:space="preserve"> :</w:t>
+      </w:r>
+      <w:proofErr w:type="gramEnd"/>
+      <w:r>
+        <w:rPr>
+          <w:rFonts w:ascii="Bookman Old Style" w:hAnsi="Bookman Old Style"/>
+          <w:b/>
+          <w:lang w:val="id-ID"/>
+        </w:rPr>
+        <w:t xml:space="preserve"> </w:t>
       </w:r>
       <w:r>
         <w:rPr>
@@ -2565,7 +2562,7 @@
     <w:lsdException w:name="Table Web 2" w:semiHidden="1" w:unhideWhenUsed="1"/>
     <w:lsdException w:name="Table Web 3" w:semiHidden="1" w:unhideWhenUsed="1"/>
     <w:lsdException w:name="Balloon Text" w:semiHidden="1" w:unhideWhenUsed="1"/>
-    <w:lsdException w:name="Table Grid" w:semiHidden="1" w:uiPriority="59" w:unhideWhenUsed="1"/>
+    <w:lsdException w:name="Table Grid" w:uiPriority="59"/>
     <w:lsdException w:name="Table Theme" w:semiHidden="1" w:unhideWhenUsed="1"/>
     <w:lsdException w:name="Placeholder Text" w:semiHidden="1"/>
     <w:lsdException w:name="No Spacing" w:uiPriority="1" w:qFormat="1"/>

</xml_diff>

<commit_message>
feat: optimize billing performance, implement site filtering, debounced search, and integrate tenant onboarding workflows
</commit_message>
<xml_diff>
--- a/rusun-backend/app/templates/template_ba_wawancara.docx
+++ b/rusun-backend/app/templates/template_ba_wawancara.docx
@@ -41,7 +41,7 @@
           <v:shape id="_x0000_s1027" type="#_x0000_t75" style="position:absolute;margin-left:-24.75pt;margin-top:1.85pt;width:64.6pt;height:71.1pt;z-index:251661312;visibility:visible;mso-wrap-style:tight;mso-wrap-edited:f">
             <v:imagedata r:id="rId6" o:title=""/>
           </v:shape>
-          <o:OLEObject Type="Embed" ProgID="Word.Picture.8" ShapeID="_x0000_s1027" DrawAspect="Content" ObjectID="_1837444644" r:id="rId7"/>
+          <o:OLEObject Type="Embed" ProgID="Word.Picture.8" ShapeID="_x0000_s1027" DrawAspect="Content" ObjectID="_1837461462" r:id="rId7"/>
         </w:object>
       </w:r>
       <w:r>
@@ -389,7 +389,7 @@
           </mc:Choice>
           <mc:Fallback>
             <w:pict>
-              <v:line w14:anchorId="26E86879" id="Line 2" o:spid="_x0000_s1026" style="position:absolute;flip:y;z-index:251660288;visibility:visible;mso-wrap-style:square;mso-width-percent:0;mso-height-percent:0;mso-wrap-distance-left:9pt;mso-wrap-distance-top:0;mso-wrap-distance-right:9pt;mso-wrap-distance-bottom:0;mso-position-horizontal:absolute;mso-position-horizontal-relative:text;mso-position-vertical:absolute;mso-position-vertical-relative:text;mso-width-percent:0;mso-height-percent:0;mso-width-relative:page;mso-height-relative:page" from="-30.4pt,9.65pt" to="502.4pt,9.65pt" o:gfxdata="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" strokeweight="4.5pt">
+              <v:line w14:anchorId="093C2908" id="Line 2" o:spid="_x0000_s1026" style="position:absolute;flip:y;z-index:251660288;visibility:visible;mso-wrap-style:square;mso-width-percent:0;mso-height-percent:0;mso-wrap-distance-left:9pt;mso-wrap-distance-top:0;mso-wrap-distance-right:9pt;mso-wrap-distance-bottom:0;mso-position-horizontal:absolute;mso-position-horizontal-relative:text;mso-position-vertical:absolute;mso-position-vertical-relative:text;mso-width-percent:0;mso-height-percent:0;mso-width-relative:page;mso-height-relative:page" from="-30.4pt,9.65pt" to="502.4pt,9.65pt" o:gfxdata="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" strokeweight="4.5pt">
                 <v:stroke linestyle="thickThin"/>
               </v:line>
             </w:pict>
@@ -1614,7 +1614,7 @@
         <mc:AlternateContent>
           <mc:Choice Requires="wps">
             <w:drawing>
-              <wp:anchor distT="0" distB="0" distL="114300" distR="114300" simplePos="0" relativeHeight="251662336" behindDoc="0" locked="0" layoutInCell="1" allowOverlap="1" wp14:anchorId="5D996689" wp14:editId="60FF7381">
+              <wp:anchor distT="0" distB="0" distL="114300" distR="114300" simplePos="0" relativeHeight="251662336" behindDoc="0" locked="0" layoutInCell="1" allowOverlap="1" wp14:anchorId="5D996689" wp14:editId="51DCA1B2">
                 <wp:simplePos x="0" y="0"/>
                 <wp:positionH relativeFrom="column">
                   <wp:posOffset>2754630</wp:posOffset>
@@ -1847,7 +1847,6 @@
                               <w:jc w:val="center"/>
                               <w:rPr>
                                 <w:rFonts w:ascii="Bookman Old Style" w:hAnsi="Bookman Old Style" w:cs="Arial"/>
-                                <w:b/>
                                 <w:lang w:val="id-ID"/>
                               </w:rPr>
                             </w:pPr>
@@ -1878,97 +1877,6 @@
                               </w:rPr>
                               <w:t>}}</w:t>
                             </w:r>
-                          </w:p>
-                          <w:p>
-                            <w:pPr>
-                              <w:jc w:val="center"/>
-                              <w:rPr>
-                                <w:rFonts w:ascii="Bookman Old Style" w:hAnsi="Bookman Old Style" w:cs="Arial"/>
-                                <w:b/>
-                                <w:lang w:val="id-ID"/>
-                              </w:rPr>
-                            </w:pPr>
-                          </w:p>
-                          <w:p>
-                            <w:pPr>
-                              <w:jc w:val="center"/>
-                              <w:rPr>
-                                <w:rFonts w:ascii="Bookman Old Style" w:hAnsi="Bookman Old Style" w:cs="Arial"/>
-                                <w:b/>
-                                <w:lang w:val="id-ID"/>
-                              </w:rPr>
-                            </w:pPr>
-                          </w:p>
-                          <w:p>
-                            <w:pPr>
-                              <w:jc w:val="center"/>
-                              <w:rPr>
-                                <w:rFonts w:ascii="Bookman Old Style" w:hAnsi="Bookman Old Style" w:cs="Arial"/>
-                                <w:b/>
-                              </w:rPr>
-                            </w:pPr>
-                            <w:r>
-                              <w:rPr>
-                                <w:rFonts w:ascii="Bookman Old Style" w:hAnsi="Bookman Old Style" w:cs="Arial"/>
-                                <w:b/>
-                                <w:lang w:val="id-ID"/>
-                              </w:rPr>
-                              <w:t>FIRMANSYAH, S. Sos</w:t>
-                            </w:r>
-                          </w:p>
-                          <w:p>
-                            <w:pPr>
-                              <w:jc w:val="center"/>
-                              <w:rPr>
-                                <w:rFonts w:ascii="Bookman Old Style" w:hAnsi="Bookman Old Style" w:cs="Arial"/>
-                              </w:rPr>
-                            </w:pPr>
-                            <w:proofErr w:type="spellStart"/>
-                            <w:r>
-                              <w:rPr>
-                                <w:rFonts w:ascii="Bookman Old Style" w:hAnsi="Bookman Old Style" w:cs="Arial"/>
-                              </w:rPr>
-                              <w:t>Penata</w:t>
-                            </w:r>
-                            <w:proofErr w:type="spellEnd"/>
-                          </w:p>
-                          <w:p>
-                            <w:pPr>
-                              <w:jc w:val="center"/>
-                              <w:rPr>
-                                <w:rFonts w:ascii="Bookman Old Style" w:hAnsi="Bookman Old Style" w:cs="Arial"/>
-                              </w:rPr>
-                            </w:pPr>
-                            <w:r>
-                              <w:rPr>
-                                <w:rFonts w:ascii="Bookman Old Style" w:hAnsi="Bookman Old Style" w:cs="Arial"/>
-                                <w:lang w:val="id-ID"/>
-                              </w:rPr>
-                              <w:t xml:space="preserve">NIP. </w:t>
-                            </w:r>
-                            <w:r>
-                              <w:rPr>
-                                <w:rFonts w:ascii="Bookman Old Style" w:hAnsi="Bookman Old Style" w:cs="Arial"/>
-                              </w:rPr>
-                              <w:t>19760325 200902 1 002</w:t>
-                            </w:r>
-                          </w:p>
-                          <w:p>
-                            <w:pPr>
-                              <w:rPr>
-                                <w:rFonts w:ascii="Bookman Old Style" w:hAnsi="Bookman Old Style" w:cs="Arial"/>
-                              </w:rPr>
-                            </w:pPr>
-                          </w:p>
-                          <w:p>
-                            <w:pPr>
-                              <w:ind w:left="1530"/>
-                              <w:jc w:val="center"/>
-                              <w:rPr>
-                                <w:rFonts w:ascii="Bookman Old Style" w:hAnsi="Bookman Old Style" w:cs="Arial"/>
-                                <w:lang w:val="id-ID"/>
-                              </w:rPr>
-                            </w:pPr>
                           </w:p>
                         </w:txbxContent>
                       </wps:txbx>
@@ -2174,7 +2082,6 @@
                         <w:jc w:val="center"/>
                         <w:rPr>
                           <w:rFonts w:ascii="Bookman Old Style" w:hAnsi="Bookman Old Style" w:cs="Arial"/>
-                          <w:b/>
                           <w:lang w:val="id-ID"/>
                         </w:rPr>
                       </w:pPr>
@@ -2205,97 +2112,6 @@
                         </w:rPr>
                         <w:t>}}</w:t>
                       </w:r>
-                    </w:p>
-                    <w:p>
-                      <w:pPr>
-                        <w:jc w:val="center"/>
-                        <w:rPr>
-                          <w:rFonts w:ascii="Bookman Old Style" w:hAnsi="Bookman Old Style" w:cs="Arial"/>
-                          <w:b/>
-                          <w:lang w:val="id-ID"/>
-                        </w:rPr>
-                      </w:pPr>
-                    </w:p>
-                    <w:p>
-                      <w:pPr>
-                        <w:jc w:val="center"/>
-                        <w:rPr>
-                          <w:rFonts w:ascii="Bookman Old Style" w:hAnsi="Bookman Old Style" w:cs="Arial"/>
-                          <w:b/>
-                          <w:lang w:val="id-ID"/>
-                        </w:rPr>
-                      </w:pPr>
-                    </w:p>
-                    <w:p>
-                      <w:pPr>
-                        <w:jc w:val="center"/>
-                        <w:rPr>
-                          <w:rFonts w:ascii="Bookman Old Style" w:hAnsi="Bookman Old Style" w:cs="Arial"/>
-                          <w:b/>
-                        </w:rPr>
-                      </w:pPr>
-                      <w:r>
-                        <w:rPr>
-                          <w:rFonts w:ascii="Bookman Old Style" w:hAnsi="Bookman Old Style" w:cs="Arial"/>
-                          <w:b/>
-                          <w:lang w:val="id-ID"/>
-                        </w:rPr>
-                        <w:t>FIRMANSYAH, S. Sos</w:t>
-                      </w:r>
-                    </w:p>
-                    <w:p>
-                      <w:pPr>
-                        <w:jc w:val="center"/>
-                        <w:rPr>
-                          <w:rFonts w:ascii="Bookman Old Style" w:hAnsi="Bookman Old Style" w:cs="Arial"/>
-                        </w:rPr>
-                      </w:pPr>
-                      <w:proofErr w:type="spellStart"/>
-                      <w:r>
-                        <w:rPr>
-                          <w:rFonts w:ascii="Bookman Old Style" w:hAnsi="Bookman Old Style" w:cs="Arial"/>
-                        </w:rPr>
-                        <w:t>Penata</w:t>
-                      </w:r>
-                      <w:proofErr w:type="spellEnd"/>
-                    </w:p>
-                    <w:p>
-                      <w:pPr>
-                        <w:jc w:val="center"/>
-                        <w:rPr>
-                          <w:rFonts w:ascii="Bookman Old Style" w:hAnsi="Bookman Old Style" w:cs="Arial"/>
-                        </w:rPr>
-                      </w:pPr>
-                      <w:r>
-                        <w:rPr>
-                          <w:rFonts w:ascii="Bookman Old Style" w:hAnsi="Bookman Old Style" w:cs="Arial"/>
-                          <w:lang w:val="id-ID"/>
-                        </w:rPr>
-                        <w:t xml:space="preserve">NIP. </w:t>
-                      </w:r>
-                      <w:r>
-                        <w:rPr>
-                          <w:rFonts w:ascii="Bookman Old Style" w:hAnsi="Bookman Old Style" w:cs="Arial"/>
-                        </w:rPr>
-                        <w:t>19760325 200902 1 002</w:t>
-                      </w:r>
-                    </w:p>
-                    <w:p>
-                      <w:pPr>
-                        <w:rPr>
-                          <w:rFonts w:ascii="Bookman Old Style" w:hAnsi="Bookman Old Style" w:cs="Arial"/>
-                        </w:rPr>
-                      </w:pPr>
-                    </w:p>
-                    <w:p>
-                      <w:pPr>
-                        <w:ind w:left="1530"/>
-                        <w:jc w:val="center"/>
-                        <w:rPr>
-                          <w:rFonts w:ascii="Bookman Old Style" w:hAnsi="Bookman Old Style" w:cs="Arial"/>
-                          <w:lang w:val="id-ID"/>
-                        </w:rPr>
-                      </w:pPr>
                     </w:p>
                   </w:txbxContent>
                 </v:textbox>
@@ -2821,7 +2637,6 @@
     <w:basedOn w:val="Normal"/>
     <w:link w:val="HeaderChar"/>
     <w:uiPriority w:val="99"/>
-    <w:semiHidden/>
     <w:unhideWhenUsed/>
     <w:rsid w:val="008535F6"/>
     <w:pPr>
@@ -2837,7 +2652,6 @@
     <w:basedOn w:val="DefaultParagraphFont"/>
     <w:link w:val="Header"/>
     <w:uiPriority w:val="99"/>
-    <w:semiHidden/>
     <w:rsid w:val="008535F6"/>
   </w:style>
   <w:style w:type="paragraph" w:styleId="Footer">
@@ -2845,7 +2659,6 @@
     <w:basedOn w:val="Normal"/>
     <w:link w:val="FooterChar"/>
     <w:uiPriority w:val="99"/>
-    <w:semiHidden/>
     <w:unhideWhenUsed/>
     <w:rsid w:val="008535F6"/>
     <w:pPr>
@@ -2861,7 +2674,6 @@
     <w:basedOn w:val="DefaultParagraphFont"/>
     <w:link w:val="Footer"/>
     <w:uiPriority w:val="99"/>
-    <w:semiHidden/>
     <w:rsid w:val="008535F6"/>
   </w:style>
   <w:style w:type="table" w:styleId="TableGrid">

</xml_diff>